<commit_message>
Add EMS interview project package and optimized MPC results
</commit_message>
<xml_diff>
--- a/docs/MPC_第7周学习报告.docx
+++ b/docs/MPC_第7周学习报告.docx
@@ -56,12 +56,7 @@
     </w:p>
     <w:p>
       <w:r>
-        <w:rPr>
-          <w:rFonts w:ascii="Microsoft YaHei" w:hAnsi="Microsoft YaHei" w:eastAsia="Microsoft YaHei"/>
-          <w:b w:val="0"/>
-          <w:sz w:val="21"/>
-        </w:rPr>
-        <w:t>MPC 在已知工况 + 能量平衡惩罚下表现优异，WLTC 氢耗 0.2011 kg，比 ECMS (0.2292 kg, +0.2% vs DP) 和 DP (0.2287 kg) 都低。</w:t>
+        <w:t>MPC 在已知工况 + 能量平衡惩罚下完成了可运行闭环。旧版 WLTC 原始氢耗为 0.2011 kg，但终端 SOC 约 0.55，说明存在电池能量透支；因此不能直接表述为“MPC 优于 DP”。优化版加入 SOC 软下限、真实终点 SOC 欠差惩罚和 FC 功率变化惩罚后，WLTC 重跑结果为 H2_raw=0.2432 kg，SOC_end=0.576，H2_eq=0.2976 kg。最终排序应以 H2_raw、SOC_end、H2_eq 三指标为准。 优化版代码单独保存为 scripts/mpc_ems_optimized.py，原 scripts/mpc_ems.py 保留旧版。</w:t>
       </w:r>
     </w:p>
     <w:tbl>
@@ -82,15 +77,7 @@
             <w:tcW w:type="dxa" w:w="2880"/>
           </w:tcPr>
           <w:p>
-            <w:pPr>
-              <w:jc w:val="center"/>
-            </w:pPr>
             <w:r>
-              <w:rPr>
-                <w:rFonts w:ascii="Microsoft YaHei" w:hAnsi="Microsoft YaHei" w:eastAsia="Microsoft YaHei"/>
-                <w:b/>
-                <w:sz w:val="19"/>
-              </w:rPr>
               <w:t>评估维度</w:t>
             </w:r>
           </w:p>
@@ -100,15 +87,7 @@
             <w:tcW w:type="dxa" w:w="2880"/>
           </w:tcPr>
           <w:p>
-            <w:pPr>
-              <w:jc w:val="center"/>
-            </w:pPr>
             <w:r>
-              <w:rPr>
-                <w:rFonts w:ascii="Microsoft YaHei" w:hAnsi="Microsoft YaHei" w:eastAsia="Microsoft YaHei"/>
-                <w:b/>
-                <w:sz w:val="19"/>
-              </w:rPr>
               <w:t>评分</w:t>
             </w:r>
           </w:p>
@@ -118,15 +97,7 @@
             <w:tcW w:type="dxa" w:w="2880"/>
           </w:tcPr>
           <w:p>
-            <w:pPr>
-              <w:jc w:val="center"/>
-            </w:pPr>
             <w:r>
-              <w:rPr>
-                <w:rFonts w:ascii="Microsoft YaHei" w:hAnsi="Microsoft YaHei" w:eastAsia="Microsoft YaHei"/>
-                <w:b/>
-                <w:sz w:val="19"/>
-              </w:rPr>
               <w:t>说明</w:t>
             </w:r>
           </w:p>
@@ -138,14 +109,7 @@
             <w:tcW w:type="dxa" w:w="2880"/>
           </w:tcPr>
           <w:p>
-            <w:pPr>
-              <w:jc w:val="center"/>
-            </w:pPr>
             <w:r>
-              <w:rPr>
-                <w:rFonts w:ascii="Microsoft YaHei" w:hAnsi="Microsoft YaHei" w:eastAsia="Microsoft YaHei"/>
-                <w:sz w:val="18"/>
-              </w:rPr>
               <w:t>MPC 理论理解</w:t>
             </w:r>
           </w:p>
@@ -155,14 +119,7 @@
             <w:tcW w:type="dxa" w:w="2880"/>
           </w:tcPr>
           <w:p>
-            <w:pPr>
-              <w:jc w:val="center"/>
-            </w:pPr>
             <w:r>
-              <w:rPr>
-                <w:rFonts w:ascii="Microsoft YaHei" w:hAnsi="Microsoft YaHei" w:eastAsia="Microsoft YaHei"/>
-                <w:sz w:val="18"/>
-              </w:rPr>
               <w:t>⭐⭐⭐⭐⭐  (5/5)</w:t>
             </w:r>
           </w:p>
@@ -172,14 +129,7 @@
             <w:tcW w:type="dxa" w:w="2880"/>
           </w:tcPr>
           <w:p>
-            <w:pPr>
-              <w:jc w:val="center"/>
-            </w:pPr>
             <w:r>
-              <w:rPr>
-                <w:rFonts w:ascii="Microsoft YaHei" w:hAnsi="Microsoft YaHei" w:eastAsia="Microsoft YaHei"/>
-                <w:sz w:val="18"/>
-              </w:rPr>
               <w:t>掌握了 receding horizon、预测模型、终端代价、N_p 影响</w:t>
             </w:r>
           </w:p>
@@ -191,14 +141,7 @@
             <w:tcW w:type="dxa" w:w="2880"/>
           </w:tcPr>
           <w:p>
-            <w:pPr>
-              <w:jc w:val="center"/>
-            </w:pPr>
             <w:r>
-              <w:rPr>
-                <w:rFonts w:ascii="Microsoft YaHei" w:hAnsi="Microsoft YaHei" w:eastAsia="Microsoft YaHei"/>
-                <w:sz w:val="18"/>
-              </w:rPr>
               <w:t>算法正确性</w:t>
             </w:r>
           </w:p>
@@ -208,14 +151,7 @@
             <w:tcW w:type="dxa" w:w="2880"/>
           </w:tcPr>
           <w:p>
-            <w:pPr>
-              <w:jc w:val="center"/>
-            </w:pPr>
             <w:r>
-              <w:rPr>
-                <w:rFonts w:ascii="Microsoft YaHei" w:hAnsi="Microsoft YaHei" w:eastAsia="Microsoft YaHei"/>
-                <w:sz w:val="18"/>
-              </w:rPr>
               <w:t>⭐⭐⭐⭐☆  (4/5)</w:t>
             </w:r>
           </w:p>
@@ -225,15 +161,8 @@
             <w:tcW w:type="dxa" w:w="2880"/>
           </w:tcPr>
           <w:p>
-            <w:pPr>
-              <w:jc w:val="center"/>
-            </w:pPr>
             <w:r>
-              <w:rPr>
-                <w:rFonts w:ascii="Microsoft YaHei" w:hAnsi="Microsoft YaHei" w:eastAsia="Microsoft YaHei"/>
-                <w:sz w:val="18"/>
-              </w:rPr>
-              <w:t>发现并修复了"无等效因子导致电池放电作弊"的 bug</w:t>
+              <w:t>已修正电池能量透支口径，并加入 SOC 软约束/终点约束</w:t>
             </w:r>
           </w:p>
         </w:tc>
@@ -244,14 +173,7 @@
             <w:tcW w:type="dxa" w:w="2880"/>
           </w:tcPr>
           <w:p>
-            <w:pPr>
-              <w:jc w:val="center"/>
-            </w:pPr>
             <w:r>
-              <w:rPr>
-                <w:rFonts w:ascii="Microsoft YaHei" w:hAnsi="Microsoft YaHei" w:eastAsia="Microsoft YaHei"/>
-                <w:sz w:val="18"/>
-              </w:rPr>
               <w:t>与 DP 接近度</w:t>
             </w:r>
           </w:p>
@@ -261,15 +183,8 @@
             <w:tcW w:type="dxa" w:w="2880"/>
           </w:tcPr>
           <w:p>
-            <w:pPr>
-              <w:jc w:val="center"/>
-            </w:pPr>
             <w:r>
-              <w:rPr>
-                <w:rFonts w:ascii="Microsoft YaHei" w:hAnsi="Microsoft YaHei" w:eastAsia="Microsoft YaHei"/>
-                <w:sz w:val="18"/>
-              </w:rPr>
-              <w:t>⭐⭐⭐⭐⭐  (5/5)</w:t>
+              <w:t>⭐⭐⭐☆☆  (3/5)</w:t>
             </w:r>
           </w:p>
         </w:tc>
@@ -278,15 +193,8 @@
             <w:tcW w:type="dxa" w:w="2880"/>
           </w:tcPr>
           <w:p>
-            <w:pPr>
-              <w:jc w:val="center"/>
-            </w:pPr>
             <w:r>
-              <w:rPr>
-                <w:rFonts w:ascii="Microsoft YaHei" w:hAnsi="Microsoft YaHei" w:eastAsia="Microsoft YaHei"/>
-                <w:sz w:val="18"/>
-              </w:rPr>
-              <w:t>MPC(0.2011) &lt; DP(0.2287)，在已知工况下等价于全局 ECMS</w:t>
+              <w:t>需以 H2_raw + SOC_end + H2_eq 三指标复核，不能只看原始氢耗</w:t>
             </w:r>
           </w:p>
         </w:tc>
@@ -297,14 +205,7 @@
             <w:tcW w:type="dxa" w:w="2880"/>
           </w:tcPr>
           <w:p>
-            <w:pPr>
-              <w:jc w:val="center"/>
-            </w:pPr>
             <w:r>
-              <w:rPr>
-                <w:rFonts w:ascii="Microsoft YaHei" w:hAnsi="Microsoft YaHei" w:eastAsia="Microsoft YaHei"/>
-                <w:sz w:val="18"/>
-              </w:rPr>
               <w:t>N_p 敏感性分析</w:t>
             </w:r>
           </w:p>
@@ -314,15 +215,8 @@
             <w:tcW w:type="dxa" w:w="2880"/>
           </w:tcPr>
           <w:p>
-            <w:pPr>
-              <w:jc w:val="center"/>
-            </w:pPr>
             <w:r>
-              <w:rPr>
-                <w:rFonts w:ascii="Microsoft YaHei" w:hAnsi="Microsoft YaHei" w:eastAsia="Microsoft YaHei"/>
-                <w:sz w:val="18"/>
-              </w:rPr>
-              <w:t>⭐⭐⭐⭐⭐  (5/5)</w:t>
+              <w:t>⭐⭐⭐⭐☆  (4/5)</w:t>
             </w:r>
           </w:p>
         </w:tc>
@@ -331,15 +225,8 @@
             <w:tcW w:type="dxa" w:w="2880"/>
           </w:tcPr>
           <w:p>
-            <w:pPr>
-              <w:jc w:val="center"/>
-            </w:pPr>
             <w:r>
-              <w:rPr>
-                <w:rFonts w:ascii="Microsoft YaHei" w:hAnsi="Microsoft YaHei" w:eastAsia="Microsoft YaHei"/>
-                <w:sz w:val="18"/>
-              </w:rPr>
-              <w:t>扫描 N_p=10→200，发现 N_p 越大氢耗越低，N_p≥50 后收敛</w:t>
+              <w:t>扫描 N_p=10→200，优化版应同步输出 H2_eq 曲线</w:t>
             </w:r>
           </w:p>
         </w:tc>
@@ -350,14 +237,7 @@
             <w:tcW w:type="dxa" w:w="2880"/>
           </w:tcPr>
           <w:p>
-            <w:pPr>
-              <w:jc w:val="center"/>
-            </w:pPr>
             <w:r>
-              <w:rPr>
-                <w:rFonts w:ascii="Microsoft YaHei" w:hAnsi="Microsoft YaHei" w:eastAsia="Microsoft YaHei"/>
-                <w:sz w:val="18"/>
-              </w:rPr>
               <w:t>代码质量</w:t>
             </w:r>
           </w:p>
@@ -367,14 +247,7 @@
             <w:tcW w:type="dxa" w:w="2880"/>
           </w:tcPr>
           <w:p>
-            <w:pPr>
-              <w:jc w:val="center"/>
-            </w:pPr>
             <w:r>
-              <w:rPr>
-                <w:rFonts w:ascii="Microsoft YaHei" w:hAnsi="Microsoft YaHei" w:eastAsia="Microsoft YaHei"/>
-                <w:sz w:val="18"/>
-              </w:rPr>
               <w:t>⭐⭐⭐⭐☆  (4/5)</w:t>
             </w:r>
           </w:p>
@@ -384,14 +257,7 @@
             <w:tcW w:type="dxa" w:w="2880"/>
           </w:tcPr>
           <w:p>
-            <w:pPr>
-              <w:jc w:val="center"/>
-            </w:pPr>
             <w:r>
-              <w:rPr>
-                <w:rFonts w:ascii="Microsoft YaHei" w:hAnsi="Microsoft YaHei" w:eastAsia="Microsoft YaHei"/>
-                <w:sz w:val="18"/>
-              </w:rPr>
               <w:t>结构清晰，支持多工况/N_p 扫描/四方法对比</w:t>
             </w:r>
           </w:p>
@@ -403,14 +269,7 @@
             <w:tcW w:type="dxa" w:w="2880"/>
           </w:tcPr>
           <w:p>
-            <w:pPr>
-              <w:jc w:val="center"/>
-            </w:pPr>
             <w:r>
-              <w:rPr>
-                <w:rFonts w:ascii="Microsoft YaHei" w:hAnsi="Microsoft YaHei" w:eastAsia="Microsoft YaHei"/>
-                <w:sz w:val="18"/>
-              </w:rPr>
               <w:t>可视化</w:t>
             </w:r>
           </w:p>
@@ -420,14 +279,7 @@
             <w:tcW w:type="dxa" w:w="2880"/>
           </w:tcPr>
           <w:p>
-            <w:pPr>
-              <w:jc w:val="center"/>
-            </w:pPr>
             <w:r>
-              <w:rPr>
-                <w:rFonts w:ascii="Microsoft YaHei" w:hAnsi="Microsoft YaHei" w:eastAsia="Microsoft YaHei"/>
-                <w:sz w:val="18"/>
-              </w:rPr>
               <w:t>⭐⭐⭐⭐⭐  (5/5)</w:t>
             </w:r>
           </w:p>
@@ -437,14 +289,7 @@
             <w:tcW w:type="dxa" w:w="2880"/>
           </w:tcPr>
           <w:p>
-            <w:pPr>
-              <w:jc w:val="center"/>
-            </w:pPr>
             <w:r>
-              <w:rPr>
-                <w:rFonts w:ascii="Microsoft YaHei" w:hAnsi="Microsoft YaHei" w:eastAsia="Microsoft YaHei"/>
-                <w:sz w:val="18"/>
-              </w:rPr>
               <w:t>四方法对比图 + N_p 敏感性图</w:t>
             </w:r>
           </w:p>
@@ -453,12 +298,7 @@
     </w:tbl>
     <w:p>
       <w:r>
-        <w:rPr>
-          <w:rFonts w:ascii="Microsoft YaHei" w:hAnsi="Microsoft YaHei" w:eastAsia="Microsoft YaHei"/>
-          <w:b w:val="0"/>
-          <w:sz w:val="21"/>
-        </w:rPr>
-        <w:t xml:space="preserve">  综合评分：约 4.5 / 5.0 — 理论与实现均完成，C++ 面向对象练习留待补充</w:t>
+        <w:t>综合评分：约 4.0 / 5.0 — 理论与实现已成型；当前重点从“跑通 MPC”转为“用公平口径复算优化版 MPC”。</w:t>
       </w:r>
     </w:p>
     <w:p>
@@ -562,15 +402,7 @@
             <w:tcW w:type="dxa" w:w="2880"/>
           </w:tcPr>
           <w:p>
-            <w:pPr>
-              <w:jc w:val="center"/>
-            </w:pPr>
             <w:r>
-              <w:rPr>
-                <w:rFonts w:ascii="Microsoft YaHei" w:hAnsi="Microsoft YaHei" w:eastAsia="Microsoft YaHei"/>
-                <w:b/>
-                <w:sz w:val="19"/>
-              </w:rPr>
               <w:t>方法</w:t>
             </w:r>
           </w:p>
@@ -580,15 +412,7 @@
             <w:tcW w:type="dxa" w:w="2880"/>
           </w:tcPr>
           <w:p>
-            <w:pPr>
-              <w:jc w:val="center"/>
-            </w:pPr>
             <w:r>
-              <w:rPr>
-                <w:rFonts w:ascii="Microsoft YaHei" w:hAnsi="Microsoft YaHei" w:eastAsia="Microsoft YaHei"/>
-                <w:b/>
-                <w:sz w:val="19"/>
-              </w:rPr>
               <w:t>λ (costate) 来源</w:t>
             </w:r>
           </w:p>
@@ -598,15 +422,7 @@
             <w:tcW w:type="dxa" w:w="2880"/>
           </w:tcPr>
           <w:p>
-            <w:pPr>
-              <w:jc w:val="center"/>
-            </w:pPr>
             <w:r>
-              <w:rPr>
-                <w:rFonts w:ascii="Microsoft YaHei" w:hAnsi="Microsoft YaHei" w:eastAsia="Microsoft YaHei"/>
-                <w:b/>
-                <w:sz w:val="19"/>
-              </w:rPr>
               <w:t>时域</w:t>
             </w:r>
           </w:p>
@@ -618,14 +434,7 @@
             <w:tcW w:type="dxa" w:w="2880"/>
           </w:tcPr>
           <w:p>
-            <w:pPr>
-              <w:jc w:val="center"/>
-            </w:pPr>
             <w:r>
-              <w:rPr>
-                <w:rFonts w:ascii="Microsoft YaHei" w:hAnsi="Microsoft YaHei" w:eastAsia="Microsoft YaHei"/>
-                <w:sz w:val="18"/>
-              </w:rPr>
               <w:t>DP</w:t>
             </w:r>
           </w:p>
@@ -635,14 +444,7 @@
             <w:tcW w:type="dxa" w:w="2880"/>
           </w:tcPr>
           <w:p>
-            <w:pPr>
-              <w:jc w:val="center"/>
-            </w:pPr>
             <w:r>
-              <w:rPr>
-                <w:rFonts w:ascii="Microsoft YaHei" w:hAnsi="Microsoft YaHei" w:eastAsia="Microsoft YaHei"/>
-                <w:sz w:val="18"/>
-              </w:rPr>
               <w:t>精确 costate（后向递推）</w:t>
             </w:r>
           </w:p>
@@ -652,14 +454,7 @@
             <w:tcW w:type="dxa" w:w="2880"/>
           </w:tcPr>
           <w:p>
-            <w:pPr>
-              <w:jc w:val="center"/>
-            </w:pPr>
             <w:r>
-              <w:rPr>
-                <w:rFonts w:ascii="Microsoft YaHei" w:hAnsi="Microsoft YaHei" w:eastAsia="Microsoft YaHei"/>
-                <w:sz w:val="18"/>
-              </w:rPr>
               <w:t>全局（全部 N 步）</w:t>
             </w:r>
           </w:p>
@@ -671,14 +466,7 @@
             <w:tcW w:type="dxa" w:w="2880"/>
           </w:tcPr>
           <w:p>
-            <w:pPr>
-              <w:jc w:val="center"/>
-            </w:pPr>
             <w:r>
-              <w:rPr>
-                <w:rFonts w:ascii="Microsoft YaHei" w:hAnsi="Microsoft YaHei" w:eastAsia="Microsoft YaHei"/>
-                <w:sz w:val="18"/>
-              </w:rPr>
               <w:t>MPC</w:t>
             </w:r>
           </w:p>
@@ -688,14 +476,7 @@
             <w:tcW w:type="dxa" w:w="2880"/>
           </w:tcPr>
           <w:p>
-            <w:pPr>
-              <w:jc w:val="center"/>
-            </w:pPr>
             <w:r>
-              <w:rPr>
-                <w:rFonts w:ascii="Microsoft YaHei" w:hAnsi="Microsoft YaHei" w:eastAsia="Microsoft YaHei"/>
-                <w:sz w:val="18"/>
-              </w:rPr>
               <w:t>终端代价梯度 ∂V/∂SOC</w:t>
             </w:r>
           </w:p>
@@ -705,14 +486,7 @@
             <w:tcW w:type="dxa" w:w="2880"/>
           </w:tcPr>
           <w:p>
-            <w:pPr>
-              <w:jc w:val="center"/>
-            </w:pPr>
             <w:r>
-              <w:rPr>
-                <w:rFonts w:ascii="Microsoft YaHei" w:hAnsi="Microsoft YaHei" w:eastAsia="Microsoft YaHei"/>
-                <w:sz w:val="18"/>
-              </w:rPr>
               <w:t>有限（N_p 步）</w:t>
             </w:r>
           </w:p>
@@ -724,14 +498,7 @@
             <w:tcW w:type="dxa" w:w="2880"/>
           </w:tcPr>
           <w:p>
-            <w:pPr>
-              <w:jc w:val="center"/>
-            </w:pPr>
             <w:r>
-              <w:rPr>
-                <w:rFonts w:ascii="Microsoft YaHei" w:hAnsi="Microsoft YaHei" w:eastAsia="Microsoft YaHei"/>
-                <w:sz w:val="18"/>
-              </w:rPr>
               <w:t>ECMS</w:t>
             </w:r>
           </w:p>
@@ -741,14 +508,7 @@
             <w:tcW w:type="dxa" w:w="2880"/>
           </w:tcPr>
           <w:p>
-            <w:pPr>
-              <w:jc w:val="center"/>
-            </w:pPr>
             <w:r>
-              <w:rPr>
-                <w:rFonts w:ascii="Microsoft YaHei" w:hAnsi="Microsoft YaHei" w:eastAsia="Microsoft YaHei"/>
-                <w:sz w:val="18"/>
-              </w:rPr>
               <w:t>恒定等效因子 s</w:t>
             </w:r>
           </w:p>
@@ -758,14 +518,7 @@
             <w:tcW w:type="dxa" w:w="2880"/>
           </w:tcPr>
           <w:p>
-            <w:pPr>
-              <w:jc w:val="center"/>
-            </w:pPr>
             <w:r>
-              <w:rPr>
-                <w:rFonts w:ascii="Microsoft YaHei" w:hAnsi="Microsoft YaHei" w:eastAsia="Microsoft YaHei"/>
-                <w:sz w:val="18"/>
-              </w:rPr>
               <w:t>瞬时（1 步）</w:t>
             </w:r>
           </w:p>
@@ -777,14 +530,7 @@
             <w:tcW w:type="dxa" w:w="2880"/>
           </w:tcPr>
           <w:p>
-            <w:pPr>
-              <w:jc w:val="center"/>
-            </w:pPr>
             <w:r>
-              <w:rPr>
-                <w:rFonts w:ascii="Microsoft YaHei" w:hAnsi="Microsoft YaHei" w:eastAsia="Microsoft YaHei"/>
-                <w:sz w:val="18"/>
-              </w:rPr>
               <w:t>A-ECMS</w:t>
             </w:r>
           </w:p>
@@ -794,14 +540,7 @@
             <w:tcW w:type="dxa" w:w="2880"/>
           </w:tcPr>
           <w:p>
-            <w:pPr>
-              <w:jc w:val="center"/>
-            </w:pPr>
             <w:r>
-              <w:rPr>
-                <w:rFonts w:ascii="Microsoft YaHei" w:hAnsi="Microsoft YaHei" w:eastAsia="Microsoft YaHei"/>
-                <w:sz w:val="18"/>
-              </w:rPr>
               <w:t>自适应 s(k) = s₀·(1+Kp·(SOC_ref-SOC))</w:t>
             </w:r>
           </w:p>
@@ -811,14 +550,7 @@
             <w:tcW w:type="dxa" w:w="2880"/>
           </w:tcPr>
           <w:p>
-            <w:pPr>
-              <w:jc w:val="center"/>
-            </w:pPr>
             <w:r>
-              <w:rPr>
-                <w:rFonts w:ascii="Microsoft YaHei" w:hAnsi="Microsoft YaHei" w:eastAsia="Microsoft YaHei"/>
-                <w:sz w:val="18"/>
-              </w:rPr>
               <w:t>瞬时（1 步）</w:t>
             </w:r>
           </w:p>
@@ -917,15 +649,7 @@
             <w:tcW w:type="dxa" w:w="1728"/>
           </w:tcPr>
           <w:p>
-            <w:pPr>
-              <w:jc w:val="center"/>
-            </w:pPr>
             <w:r>
-              <w:rPr>
-                <w:rFonts w:ascii="Microsoft YaHei" w:hAnsi="Microsoft YaHei" w:eastAsia="Microsoft YaHei"/>
-                <w:b/>
-                <w:sz w:val="19"/>
-              </w:rPr>
               <w:t>指标</w:t>
             </w:r>
           </w:p>
@@ -935,15 +659,7 @@
             <w:tcW w:type="dxa" w:w="1728"/>
           </w:tcPr>
           <w:p>
-            <w:pPr>
-              <w:jc w:val="center"/>
-            </w:pPr>
             <w:r>
-              <w:rPr>
-                <w:rFonts w:ascii="Microsoft YaHei" w:hAnsi="Microsoft YaHei" w:eastAsia="Microsoft YaHei"/>
-                <w:b/>
-                <w:sz w:val="19"/>
-              </w:rPr>
               <w:t>规则控制器</w:t>
             </w:r>
           </w:p>
@@ -953,15 +669,7 @@
             <w:tcW w:type="dxa" w:w="1728"/>
           </w:tcPr>
           <w:p>
-            <w:pPr>
-              <w:jc w:val="center"/>
-            </w:pPr>
             <w:r>
-              <w:rPr>
-                <w:rFonts w:ascii="Microsoft YaHei" w:hAnsi="Microsoft YaHei" w:eastAsia="Microsoft YaHei"/>
-                <w:b/>
-                <w:sz w:val="19"/>
-              </w:rPr>
               <w:t>DP（基准）</w:t>
             </w:r>
           </w:p>
@@ -971,15 +679,7 @@
             <w:tcW w:type="dxa" w:w="1728"/>
           </w:tcPr>
           <w:p>
-            <w:pPr>
-              <w:jc w:val="center"/>
-            </w:pPr>
             <w:r>
-              <w:rPr>
-                <w:rFonts w:ascii="Microsoft YaHei" w:hAnsi="Microsoft YaHei" w:eastAsia="Microsoft YaHei"/>
-                <w:b/>
-                <w:sz w:val="19"/>
-              </w:rPr>
               <w:t>ECMS (s=130)</w:t>
             </w:r>
           </w:p>
@@ -989,15 +689,7 @@
             <w:tcW w:type="dxa" w:w="1728"/>
           </w:tcPr>
           <w:p>
-            <w:pPr>
-              <w:jc w:val="center"/>
-            </w:pPr>
             <w:r>
-              <w:rPr>
-                <w:rFonts w:ascii="Microsoft YaHei" w:hAnsi="Microsoft YaHei" w:eastAsia="Microsoft YaHei"/>
-                <w:b/>
-                <w:sz w:val="19"/>
-              </w:rPr>
               <w:t>MPC (N_p=50)</w:t>
             </w:r>
           </w:p>
@@ -1009,14 +701,7 @@
             <w:tcW w:type="dxa" w:w="1728"/>
           </w:tcPr>
           <w:p>
-            <w:pPr>
-              <w:jc w:val="center"/>
-            </w:pPr>
             <w:r>
-              <w:rPr>
-                <w:rFonts w:ascii="Microsoft YaHei" w:hAnsi="Microsoft YaHei" w:eastAsia="Microsoft YaHei"/>
-                <w:sz w:val="18"/>
-              </w:rPr>
               <w:t>总氢耗 (kg)</w:t>
             </w:r>
           </w:p>
@@ -1026,14 +711,7 @@
             <w:tcW w:type="dxa" w:w="1728"/>
           </w:tcPr>
           <w:p>
-            <w:pPr>
-              <w:jc w:val="center"/>
-            </w:pPr>
             <w:r>
-              <w:rPr>
-                <w:rFonts w:ascii="Microsoft YaHei" w:hAnsi="Microsoft YaHei" w:eastAsia="Microsoft YaHei"/>
-                <w:sz w:val="18"/>
-              </w:rPr>
               <w:t>0.2831</w:t>
             </w:r>
           </w:p>
@@ -1043,14 +721,7 @@
             <w:tcW w:type="dxa" w:w="1728"/>
           </w:tcPr>
           <w:p>
-            <w:pPr>
-              <w:jc w:val="center"/>
-            </w:pPr>
             <w:r>
-              <w:rPr>
-                <w:rFonts w:ascii="Microsoft YaHei" w:hAnsi="Microsoft YaHei" w:eastAsia="Microsoft YaHei"/>
-                <w:sz w:val="18"/>
-              </w:rPr>
               <w:t>0.2287</w:t>
             </w:r>
           </w:p>
@@ -1060,14 +731,7 @@
             <w:tcW w:type="dxa" w:w="1728"/>
           </w:tcPr>
           <w:p>
-            <w:pPr>
-              <w:jc w:val="center"/>
-            </w:pPr>
             <w:r>
-              <w:rPr>
-                <w:rFonts w:ascii="Microsoft YaHei" w:hAnsi="Microsoft YaHei" w:eastAsia="Microsoft YaHei"/>
-                <w:sz w:val="18"/>
-              </w:rPr>
               <w:t>0.2292</w:t>
             </w:r>
           </w:p>
@@ -1077,15 +741,8 @@
             <w:tcW w:type="dxa" w:w="1728"/>
           </w:tcPr>
           <w:p>
-            <w:pPr>
-              <w:jc w:val="center"/>
-            </w:pPr>
             <w:r>
-              <w:rPr>
-                <w:rFonts w:ascii="Microsoft YaHei" w:hAnsi="Microsoft YaHei" w:eastAsia="Microsoft YaHei"/>
-                <w:sz w:val="18"/>
-              </w:rPr>
-              <w:t>0.2011</w:t>
+              <w:t>0.2432</w:t>
             </w:r>
           </w:p>
         </w:tc>
@@ -1096,15 +753,8 @@
             <w:tcW w:type="dxa" w:w="1728"/>
           </w:tcPr>
           <w:p>
-            <w:pPr>
-              <w:jc w:val="center"/>
-            </w:pPr>
             <w:r>
-              <w:rPr>
-                <w:rFonts w:ascii="Microsoft YaHei" w:hAnsi="Microsoft YaHei" w:eastAsia="Microsoft YaHei"/>
-                <w:sz w:val="18"/>
-              </w:rPr>
-              <w:t>相对 DP 差距</w:t>
+              <w:t>相对 DP 差距（原始）</w:t>
             </w:r>
           </w:p>
         </w:tc>
@@ -1113,14 +763,7 @@
             <w:tcW w:type="dxa" w:w="1728"/>
           </w:tcPr>
           <w:p>
-            <w:pPr>
-              <w:jc w:val="center"/>
-            </w:pPr>
             <w:r>
-              <w:rPr>
-                <w:rFonts w:ascii="Microsoft YaHei" w:hAnsi="Microsoft YaHei" w:eastAsia="Microsoft YaHei"/>
-                <w:sz w:val="18"/>
-              </w:rPr>
               <w:t>+23.8%</w:t>
             </w:r>
           </w:p>
@@ -1130,14 +773,7 @@
             <w:tcW w:type="dxa" w:w="1728"/>
           </w:tcPr>
           <w:p>
-            <w:pPr>
-              <w:jc w:val="center"/>
-            </w:pPr>
             <w:r>
-              <w:rPr>
-                <w:rFonts w:ascii="Microsoft YaHei" w:hAnsi="Microsoft YaHei" w:eastAsia="Microsoft YaHei"/>
-                <w:sz w:val="18"/>
-              </w:rPr>
               <w:t>基准</w:t>
             </w:r>
           </w:p>
@@ -1147,14 +783,7 @@
             <w:tcW w:type="dxa" w:w="1728"/>
           </w:tcPr>
           <w:p>
-            <w:pPr>
-              <w:jc w:val="center"/>
-            </w:pPr>
             <w:r>
-              <w:rPr>
-                <w:rFonts w:ascii="Microsoft YaHei" w:hAnsi="Microsoft YaHei" w:eastAsia="Microsoft YaHei"/>
-                <w:sz w:val="18"/>
-              </w:rPr>
               <w:t>+0.2%</w:t>
             </w:r>
           </w:p>
@@ -1164,15 +793,8 @@
             <w:tcW w:type="dxa" w:w="1728"/>
           </w:tcPr>
           <w:p>
-            <w:pPr>
-              <w:jc w:val="center"/>
-            </w:pPr>
             <w:r>
-              <w:rPr>
-                <w:rFonts w:ascii="Microsoft YaHei" w:hAnsi="Microsoft YaHei" w:eastAsia="Microsoft YaHei"/>
-                <w:sz w:val="18"/>
-              </w:rPr>
-              <w:t>-12.1%</w:t>
+              <w:t>+6.4%（优化版原始氢耗；需结合 H2_eq）</w:t>
             </w:r>
           </w:p>
         </w:tc>
@@ -1183,14 +805,7 @@
             <w:tcW w:type="dxa" w:w="1728"/>
           </w:tcPr>
           <w:p>
-            <w:pPr>
-              <w:jc w:val="center"/>
-            </w:pPr>
             <w:r>
-              <w:rPr>
-                <w:rFonts w:ascii="Microsoft YaHei" w:hAnsi="Microsoft YaHei" w:eastAsia="Microsoft YaHei"/>
-                <w:sz w:val="18"/>
-              </w:rPr>
               <w:t>SOC 初→终</w:t>
             </w:r>
           </w:p>
@@ -1200,14 +815,7 @@
             <w:tcW w:type="dxa" w:w="1728"/>
           </w:tcPr>
           <w:p>
-            <w:pPr>
-              <w:jc w:val="center"/>
-            </w:pPr>
             <w:r>
-              <w:rPr>
-                <w:rFonts w:ascii="Microsoft YaHei" w:hAnsi="Microsoft YaHei" w:eastAsia="Microsoft YaHei"/>
-                <w:sz w:val="18"/>
-              </w:rPr>
               <w:t>0.60→0.614</w:t>
             </w:r>
           </w:p>
@@ -1217,14 +825,7 @@
             <w:tcW w:type="dxa" w:w="1728"/>
           </w:tcPr>
           <w:p>
-            <w:pPr>
-              <w:jc w:val="center"/>
-            </w:pPr>
             <w:r>
-              <w:rPr>
-                <w:rFonts w:ascii="Microsoft YaHei" w:hAnsi="Microsoft YaHei" w:eastAsia="Microsoft YaHei"/>
-                <w:sz w:val="18"/>
-              </w:rPr>
               <w:t>0.60→0.574</w:t>
             </w:r>
           </w:p>
@@ -1234,14 +835,7 @@
             <w:tcW w:type="dxa" w:w="1728"/>
           </w:tcPr>
           <w:p>
-            <w:pPr>
-              <w:jc w:val="center"/>
-            </w:pPr>
             <w:r>
-              <w:rPr>
-                <w:rFonts w:ascii="Microsoft YaHei" w:hAnsi="Microsoft YaHei" w:eastAsia="Microsoft YaHei"/>
-                <w:sz w:val="18"/>
-              </w:rPr>
               <w:t>0.60→0.580</w:t>
             </w:r>
           </w:p>
@@ -1251,15 +845,8 @@
             <w:tcW w:type="dxa" w:w="1728"/>
           </w:tcPr>
           <w:p>
-            <w:pPr>
-              <w:jc w:val="center"/>
-            </w:pPr>
             <w:r>
-              <w:rPr>
-                <w:rFonts w:ascii="Microsoft YaHei" w:hAnsi="Microsoft YaHei" w:eastAsia="Microsoft YaHei"/>
-                <w:sz w:val="18"/>
-              </w:rPr>
-              <w:t>0.60→0.550</w:t>
+              <w:t>0.60→0.576</w:t>
             </w:r>
           </w:p>
         </w:tc>
@@ -1270,14 +857,7 @@
             <w:tcW w:type="dxa" w:w="1728"/>
           </w:tcPr>
           <w:p>
-            <w:pPr>
-              <w:jc w:val="center"/>
-            </w:pPr>
             <w:r>
-              <w:rPr>
-                <w:rFonts w:ascii="Microsoft YaHei" w:hAnsi="Microsoft YaHei" w:eastAsia="Microsoft YaHei"/>
-                <w:sz w:val="18"/>
-              </w:rPr>
               <w:t>FC 平均效率</w:t>
             </w:r>
           </w:p>
@@ -1287,14 +867,7 @@
             <w:tcW w:type="dxa" w:w="1728"/>
           </w:tcPr>
           <w:p>
-            <w:pPr>
-              <w:jc w:val="center"/>
-            </w:pPr>
             <w:r>
-              <w:rPr>
-                <w:rFonts w:ascii="Microsoft YaHei" w:hAnsi="Microsoft YaHei" w:eastAsia="Microsoft YaHei"/>
-                <w:sz w:val="18"/>
-              </w:rPr>
               <w:t>40.4%</w:t>
             </w:r>
           </w:p>
@@ -1304,14 +877,7 @@
             <w:tcW w:type="dxa" w:w="1728"/>
           </w:tcPr>
           <w:p>
-            <w:pPr>
-              <w:jc w:val="center"/>
-            </w:pPr>
             <w:r>
-              <w:rPr>
-                <w:rFonts w:ascii="Microsoft YaHei" w:hAnsi="Microsoft YaHei" w:eastAsia="Microsoft YaHei"/>
-                <w:sz w:val="18"/>
-              </w:rPr>
               <w:t>30.3%</w:t>
             </w:r>
           </w:p>
@@ -1321,14 +887,7 @@
             <w:tcW w:type="dxa" w:w="1728"/>
           </w:tcPr>
           <w:p>
-            <w:pPr>
-              <w:jc w:val="center"/>
-            </w:pPr>
             <w:r>
-              <w:rPr>
-                <w:rFonts w:ascii="Microsoft YaHei" w:hAnsi="Microsoft YaHei" w:eastAsia="Microsoft YaHei"/>
-                <w:sz w:val="18"/>
-              </w:rPr>
               <w:t>26.1%</w:t>
             </w:r>
           </w:p>
@@ -1338,14 +897,7 @@
             <w:tcW w:type="dxa" w:w="1728"/>
           </w:tcPr>
           <w:p>
-            <w:pPr>
-              <w:jc w:val="center"/>
-            </w:pPr>
             <w:r>
-              <w:rPr>
-                <w:rFonts w:ascii="Microsoft YaHei" w:hAnsi="Microsoft YaHei" w:eastAsia="Microsoft YaHei"/>
-                <w:sz w:val="18"/>
-              </w:rPr>
               <w:t>24.6%</w:t>
             </w:r>
           </w:p>
@@ -1357,14 +909,7 @@
             <w:tcW w:type="dxa" w:w="1728"/>
           </w:tcPr>
           <w:p>
-            <w:pPr>
-              <w:jc w:val="center"/>
-            </w:pPr>
             <w:r>
-              <w:rPr>
-                <w:rFonts w:ascii="Microsoft YaHei" w:hAnsi="Microsoft YaHei" w:eastAsia="Microsoft YaHei"/>
-                <w:sz w:val="18"/>
-              </w:rPr>
               <w:t>FC &gt;50% 占比</w:t>
             </w:r>
           </w:p>
@@ -1374,14 +919,7 @@
             <w:tcW w:type="dxa" w:w="1728"/>
           </w:tcPr>
           <w:p>
-            <w:pPr>
-              <w:jc w:val="center"/>
-            </w:pPr>
             <w:r>
-              <w:rPr>
-                <w:rFonts w:ascii="Microsoft YaHei" w:hAnsi="Microsoft YaHei" w:eastAsia="Microsoft YaHei"/>
-                <w:sz w:val="18"/>
-              </w:rPr>
               <w:t>20.8%</w:t>
             </w:r>
           </w:p>
@@ -1391,14 +929,7 @@
             <w:tcW w:type="dxa" w:w="1728"/>
           </w:tcPr>
           <w:p>
-            <w:pPr>
-              <w:jc w:val="center"/>
-            </w:pPr>
             <w:r>
-              <w:rPr>
-                <w:rFonts w:ascii="Microsoft YaHei" w:hAnsi="Microsoft YaHei" w:eastAsia="Microsoft YaHei"/>
-                <w:sz w:val="18"/>
-              </w:rPr>
               <w:t>40.5%</w:t>
             </w:r>
           </w:p>
@@ -1408,14 +939,7 @@
             <w:tcW w:type="dxa" w:w="1728"/>
           </w:tcPr>
           <w:p>
-            <w:pPr>
-              <w:jc w:val="center"/>
-            </w:pPr>
             <w:r>
-              <w:rPr>
-                <w:rFonts w:ascii="Microsoft YaHei" w:hAnsi="Microsoft YaHei" w:eastAsia="Microsoft YaHei"/>
-                <w:sz w:val="18"/>
-              </w:rPr>
               <w:t>20.9%</w:t>
             </w:r>
           </w:p>
@@ -1425,14 +949,7 @@
             <w:tcW w:type="dxa" w:w="1728"/>
           </w:tcPr>
           <w:p>
-            <w:pPr>
-              <w:jc w:val="center"/>
-            </w:pPr>
             <w:r>
-              <w:rPr>
-                <w:rFonts w:ascii="Microsoft YaHei" w:hAnsi="Microsoft YaHei" w:eastAsia="Microsoft YaHei"/>
-                <w:sz w:val="18"/>
-              </w:rPr>
               <w:t>15.9%</w:t>
             </w:r>
           </w:p>
@@ -1444,14 +961,7 @@
             <w:tcW w:type="dxa" w:w="1728"/>
           </w:tcPr>
           <w:p>
-            <w:pPr>
-              <w:jc w:val="center"/>
-            </w:pPr>
             <w:r>
-              <w:rPr>
-                <w:rFonts w:ascii="Microsoft YaHei" w:hAnsi="Microsoft YaHei" w:eastAsia="Microsoft YaHei"/>
-                <w:sz w:val="18"/>
-              </w:rPr>
               <w:t>FC 最大功率 (kW)</w:t>
             </w:r>
           </w:p>
@@ -1461,14 +971,7 @@
             <w:tcW w:type="dxa" w:w="1728"/>
           </w:tcPr>
           <w:p>
-            <w:pPr>
-              <w:jc w:val="center"/>
-            </w:pPr>
             <w:r>
-              <w:rPr>
-                <w:rFonts w:ascii="Microsoft YaHei" w:hAnsi="Microsoft YaHei" w:eastAsia="Microsoft YaHei"/>
-                <w:sz w:val="18"/>
-              </w:rPr>
               <w:t>25.0</w:t>
             </w:r>
           </w:p>
@@ -1478,14 +981,7 @@
             <w:tcW w:type="dxa" w:w="1728"/>
           </w:tcPr>
           <w:p>
-            <w:pPr>
-              <w:jc w:val="center"/>
-            </w:pPr>
             <w:r>
-              <w:rPr>
-                <w:rFonts w:ascii="Microsoft YaHei" w:hAnsi="Microsoft YaHei" w:eastAsia="Microsoft YaHei"/>
-                <w:sz w:val="18"/>
-              </w:rPr>
               <w:t>19.9</w:t>
             </w:r>
           </w:p>
@@ -1495,14 +991,7 @@
             <w:tcW w:type="dxa" w:w="1728"/>
           </w:tcPr>
           <w:p>
-            <w:pPr>
-              <w:jc w:val="center"/>
-            </w:pPr>
             <w:r>
-              <w:rPr>
-                <w:rFonts w:ascii="Microsoft YaHei" w:hAnsi="Microsoft YaHei" w:eastAsia="Microsoft YaHei"/>
-                <w:sz w:val="18"/>
-              </w:rPr>
               <w:t>26.9</w:t>
             </w:r>
           </w:p>
@@ -1512,15 +1001,112 @@
             <w:tcW w:type="dxa" w:w="1728"/>
           </w:tcPr>
           <w:p>
-            <w:pPr>
-              <w:jc w:val="center"/>
-            </w:pPr>
             <w:r>
-              <w:rPr>
-                <w:rFonts w:ascii="Microsoft YaHei" w:hAnsi="Microsoft YaHei" w:eastAsia="Microsoft YaHei"/>
-                <w:sz w:val="18"/>
-              </w:rPr>
               <w:t>30.0</w:t>
+            </w:r>
+          </w:p>
+        </w:tc>
+      </w:tr>
+      <w:tr>
+        <w:tc>
+          <w:tcPr>
+            <w:tcW w:type="dxa" w:w="1728"/>
+          </w:tcPr>
+          <w:p>
+            <w:r>
+              <w:t>公平比较口径</w:t>
+            </w:r>
+          </w:p>
+        </w:tc>
+        <w:tc>
+          <w:tcPr>
+            <w:tcW w:type="dxa" w:w="1728"/>
+          </w:tcPr>
+          <w:p>
+            <w:r>
+              <w:t>需看 H2_eq</w:t>
+            </w:r>
+          </w:p>
+        </w:tc>
+        <w:tc>
+          <w:tcPr>
+            <w:tcW w:type="dxa" w:w="1728"/>
+          </w:tcPr>
+          <w:p>
+            <w:r>
+              <w:t>需看 H2_eq</w:t>
+            </w:r>
+          </w:p>
+        </w:tc>
+        <w:tc>
+          <w:tcPr>
+            <w:tcW w:type="dxa" w:w="1728"/>
+          </w:tcPr>
+          <w:p>
+            <w:r>
+              <w:t>需看 H2_eq</w:t>
+            </w:r>
+          </w:p>
+        </w:tc>
+        <w:tc>
+          <w:tcPr>
+            <w:tcW w:type="dxa" w:w="1728"/>
+          </w:tcPr>
+          <w:p>
+            <w:r>
+              <w:t>H2_eq=0.2976 kg</w:t>
+            </w:r>
+          </w:p>
+        </w:tc>
+      </w:tr>
+      <w:tr>
+        <w:tc>
+          <w:tcPr>
+            <w:tcW w:type="dxa" w:w="1728"/>
+          </w:tcPr>
+          <w:p>
+            <w:r>
+              <w:t>优化版状态</w:t>
+            </w:r>
+          </w:p>
+        </w:tc>
+        <w:tc>
+          <w:tcPr>
+            <w:tcW w:type="dxa" w:w="1728"/>
+          </w:tcPr>
+          <w:p>
+            <w:r>
+              <w:t>不变</w:t>
+            </w:r>
+          </w:p>
+        </w:tc>
+        <w:tc>
+          <w:tcPr>
+            <w:tcW w:type="dxa" w:w="1728"/>
+          </w:tcPr>
+          <w:p>
+            <w:r>
+              <w:t>基准</w:t>
+            </w:r>
+          </w:p>
+        </w:tc>
+        <w:tc>
+          <w:tcPr>
+            <w:tcW w:type="dxa" w:w="1728"/>
+          </w:tcPr>
+          <w:p>
+            <w:r>
+              <w:t>对比项</w:t>
+            </w:r>
+          </w:p>
+        </w:tc>
+        <w:tc>
+          <w:tcPr>
+            <w:tcW w:type="dxa" w:w="1728"/>
+          </w:tcPr>
+          <w:p>
+            <w:r>
+              <w:t>已加入 SOC 软约束 + 终点欠差惩罚 + FC slew 惩罚</w:t>
             </w:r>
           </w:p>
         </w:tc>
@@ -1558,22 +1144,12 @@
     </w:p>
     <w:p>
       <w:r>
-        <w:rPr>
-          <w:rFonts w:ascii="Microsoft YaHei" w:hAnsi="Microsoft YaHei" w:eastAsia="Microsoft YaHei"/>
-          <w:b w:val="0"/>
-          <w:sz w:val="21"/>
-        </w:rPr>
-        <w:t>② MPC 在已知工况 + N_p=50 时表现优于 DP，这是因为 MPC 有等效因子 s=130 的能量引导，而 DP 的终端惩罚 β=10000 过于严格限制了 SOC 范围。在"公平对比"下（去掉 DP 的超强终端惩罚），MPC 和 DP 应接近。</w:t>
+        <w:t>② MPC 是否优于其他策略不能只看原始氢耗；如果 SOC_end 更低，说明部分收益来自电池能量透支。公平对比应统一终端 SOC 或使用 SOC 等效修正氢耗。</w:t>
       </w:r>
     </w:p>
     <w:p>
       <w:r>
-        <w:rPr>
-          <w:rFonts w:ascii="Microsoft YaHei" w:hAnsi="Microsoft YaHei" w:eastAsia="Microsoft YaHei"/>
-          <w:b w:val="0"/>
-          <w:sz w:val="21"/>
-        </w:rPr>
-        <w:t>③ MPC 的 FC 效率 (24.6%) 低于 DP (30.3%)，说明 MPC 的局部优化不如 DP 全局。</w:t>
+        <w:t>③ 优化版 MPC 已重跑：WLTC H2_raw=0.2432 kg、SOC_end=0.576、H2_eq=0.2976 kg；NEDC H2_raw=0.0812 kg、SOC_end=0.574、H2_eq=0.1403 kg。</w:t>
       </w:r>
     </w:p>
     <w:p>
@@ -1588,13 +1164,7 @@
     </w:p>
     <w:p>
       <w:r>
-        <w:rPr>
-          <w:rFonts w:ascii="Microsoft YaHei" w:hAnsi="Microsoft YaHei" w:eastAsia="Microsoft YaHei"/>
-          <w:b/>
-          <w:color w:val="008000"/>
-          <w:sz w:val="21"/>
-        </w:rPr>
-        <w:t>✅ 通过 MPC 在已知工况下表现最优，但实际车辆上工况未知，ECMS 的 0.2% 差距更实用。</w:t>
+        <w:t>⚠️ 需关注 MPC 闭环实现通过；最终结论以优化版 H2_eq 和终端 SOC 复算结果为准。</w:t>
       </w:r>
     </w:p>
     <w:p>
@@ -1637,15 +1207,7 @@
             <w:tcW w:type="dxa" w:w="2160"/>
           </w:tcPr>
           <w:p>
-            <w:pPr>
-              <w:jc w:val="center"/>
-            </w:pPr>
             <w:r>
-              <w:rPr>
-                <w:rFonts w:ascii="Microsoft YaHei" w:hAnsi="Microsoft YaHei" w:eastAsia="Microsoft YaHei"/>
-                <w:b/>
-                <w:sz w:val="19"/>
-              </w:rPr>
               <w:t>N_p</w:t>
             </w:r>
           </w:p>
@@ -1655,15 +1217,7 @@
             <w:tcW w:type="dxa" w:w="2160"/>
           </w:tcPr>
           <w:p>
-            <w:pPr>
-              <w:jc w:val="center"/>
-            </w:pPr>
             <w:r>
-              <w:rPr>
-                <w:rFonts w:ascii="Microsoft YaHei" w:hAnsi="Microsoft YaHei" w:eastAsia="Microsoft YaHei"/>
-                <w:b/>
-                <w:sz w:val="19"/>
-              </w:rPr>
               <w:t>氢耗 (kg)</w:t>
             </w:r>
           </w:p>
@@ -1673,15 +1227,7 @@
             <w:tcW w:type="dxa" w:w="2160"/>
           </w:tcPr>
           <w:p>
-            <w:pPr>
-              <w:jc w:val="center"/>
-            </w:pPr>
             <w:r>
-              <w:rPr>
-                <w:rFonts w:ascii="Microsoft YaHei" w:hAnsi="Microsoft YaHei" w:eastAsia="Microsoft YaHei"/>
-                <w:b/>
-                <w:sz w:val="19"/>
-              </w:rPr>
               <w:t>SOC_end</w:t>
             </w:r>
           </w:p>
@@ -1691,15 +1237,7 @@
             <w:tcW w:type="dxa" w:w="2160"/>
           </w:tcPr>
           <w:p>
-            <w:pPr>
-              <w:jc w:val="center"/>
-            </w:pPr>
             <w:r>
-              <w:rPr>
-                <w:rFonts w:ascii="Microsoft YaHei" w:hAnsi="Microsoft YaHei" w:eastAsia="Microsoft YaHei"/>
-                <w:b/>
-                <w:sz w:val="19"/>
-              </w:rPr>
               <w:t>相对 N_p=200 的差距</w:t>
             </w:r>
           </w:p>
@@ -1711,14 +1249,7 @@
             <w:tcW w:type="dxa" w:w="2160"/>
           </w:tcPr>
           <w:p>
-            <w:pPr>
-              <w:jc w:val="center"/>
-            </w:pPr>
             <w:r>
-              <w:rPr>
-                <w:rFonts w:ascii="Microsoft YaHei" w:hAnsi="Microsoft YaHei" w:eastAsia="Microsoft YaHei"/>
-                <w:sz w:val="18"/>
-              </w:rPr>
               <w:t>10</w:t>
             </w:r>
           </w:p>
@@ -1728,14 +1259,7 @@
             <w:tcW w:type="dxa" w:w="2160"/>
           </w:tcPr>
           <w:p>
-            <w:pPr>
-              <w:jc w:val="center"/>
-            </w:pPr>
             <w:r>
-              <w:rPr>
-                <w:rFonts w:ascii="Microsoft YaHei" w:hAnsi="Microsoft YaHei" w:eastAsia="Microsoft YaHei"/>
-                <w:sz w:val="18"/>
-              </w:rPr>
               <w:t>0.1799</w:t>
             </w:r>
           </w:p>
@@ -1745,14 +1269,7 @@
             <w:tcW w:type="dxa" w:w="2160"/>
           </w:tcPr>
           <w:p>
-            <w:pPr>
-              <w:jc w:val="center"/>
-            </w:pPr>
             <w:r>
-              <w:rPr>
-                <w:rFonts w:ascii="Microsoft YaHei" w:hAnsi="Microsoft YaHei" w:eastAsia="Microsoft YaHei"/>
-                <w:sz w:val="18"/>
-              </w:rPr>
               <w:t>0.533</w:t>
             </w:r>
           </w:p>
@@ -1762,14 +1279,7 @@
             <w:tcW w:type="dxa" w:w="2160"/>
           </w:tcPr>
           <w:p>
-            <w:pPr>
-              <w:jc w:val="center"/>
-            </w:pPr>
             <w:r>
-              <w:rPr>
-                <w:rFonts w:ascii="Microsoft YaHei" w:hAnsi="Microsoft YaHei" w:eastAsia="Microsoft YaHei"/>
-                <w:sz w:val="18"/>
-              </w:rPr>
               <w:t>+8.7%</w:t>
             </w:r>
           </w:p>
@@ -1781,14 +1291,7 @@
             <w:tcW w:type="dxa" w:w="2160"/>
           </w:tcPr>
           <w:p>
-            <w:pPr>
-              <w:jc w:val="center"/>
-            </w:pPr>
             <w:r>
-              <w:rPr>
-                <w:rFonts w:ascii="Microsoft YaHei" w:hAnsi="Microsoft YaHei" w:eastAsia="Microsoft YaHei"/>
-                <w:sz w:val="18"/>
-              </w:rPr>
               <w:t>20</w:t>
             </w:r>
           </w:p>
@@ -1798,14 +1301,7 @@
             <w:tcW w:type="dxa" w:w="2160"/>
           </w:tcPr>
           <w:p>
-            <w:pPr>
-              <w:jc w:val="center"/>
-            </w:pPr>
             <w:r>
-              <w:rPr>
-                <w:rFonts w:ascii="Microsoft YaHei" w:hAnsi="Microsoft YaHei" w:eastAsia="Microsoft YaHei"/>
-                <w:sz w:val="18"/>
-              </w:rPr>
               <w:t>0.1798</w:t>
             </w:r>
           </w:p>
@@ -1815,14 +1311,7 @@
             <w:tcW w:type="dxa" w:w="2160"/>
           </w:tcPr>
           <w:p>
-            <w:pPr>
-              <w:jc w:val="center"/>
-            </w:pPr>
             <w:r>
-              <w:rPr>
-                <w:rFonts w:ascii="Microsoft YaHei" w:hAnsi="Microsoft YaHei" w:eastAsia="Microsoft YaHei"/>
-                <w:sz w:val="18"/>
-              </w:rPr>
               <w:t>0.533</w:t>
             </w:r>
           </w:p>
@@ -1832,14 +1321,7 @@
             <w:tcW w:type="dxa" w:w="2160"/>
           </w:tcPr>
           <w:p>
-            <w:pPr>
-              <w:jc w:val="center"/>
-            </w:pPr>
             <w:r>
-              <w:rPr>
-                <w:rFonts w:ascii="Microsoft YaHei" w:hAnsi="Microsoft YaHei" w:eastAsia="Microsoft YaHei"/>
-                <w:sz w:val="18"/>
-              </w:rPr>
               <w:t>+8.7%</w:t>
             </w:r>
           </w:p>
@@ -1851,14 +1333,7 @@
             <w:tcW w:type="dxa" w:w="2160"/>
           </w:tcPr>
           <w:p>
-            <w:pPr>
-              <w:jc w:val="center"/>
-            </w:pPr>
             <w:r>
-              <w:rPr>
-                <w:rFonts w:ascii="Microsoft YaHei" w:hAnsi="Microsoft YaHei" w:eastAsia="Microsoft YaHei"/>
-                <w:sz w:val="18"/>
-              </w:rPr>
               <w:t>30</w:t>
             </w:r>
           </w:p>
@@ -1868,14 +1343,7 @@
             <w:tcW w:type="dxa" w:w="2160"/>
           </w:tcPr>
           <w:p>
-            <w:pPr>
-              <w:jc w:val="center"/>
-            </w:pPr>
             <w:r>
-              <w:rPr>
-                <w:rFonts w:ascii="Microsoft YaHei" w:hAnsi="Microsoft YaHei" w:eastAsia="Microsoft YaHei"/>
-                <w:sz w:val="18"/>
-              </w:rPr>
               <w:t>0.2049</w:t>
             </w:r>
           </w:p>
@@ -1885,14 +1353,7 @@
             <w:tcW w:type="dxa" w:w="2160"/>
           </w:tcPr>
           <w:p>
-            <w:pPr>
-              <w:jc w:val="center"/>
-            </w:pPr>
             <w:r>
-              <w:rPr>
-                <w:rFonts w:ascii="Microsoft YaHei" w:hAnsi="Microsoft YaHei" w:eastAsia="Microsoft YaHei"/>
-                <w:sz w:val="18"/>
-              </w:rPr>
               <w:t>0.550</w:t>
             </w:r>
           </w:p>
@@ -1902,14 +1363,7 @@
             <w:tcW w:type="dxa" w:w="2160"/>
           </w:tcPr>
           <w:p>
-            <w:pPr>
-              <w:jc w:val="center"/>
-            </w:pPr>
             <w:r>
-              <w:rPr>
-                <w:rFonts w:ascii="Microsoft YaHei" w:hAnsi="Microsoft YaHei" w:eastAsia="Microsoft YaHei"/>
-                <w:sz w:val="18"/>
-              </w:rPr>
               <w:t>+6.6%</w:t>
             </w:r>
           </w:p>
@@ -1921,14 +1375,7 @@
             <w:tcW w:type="dxa" w:w="2160"/>
           </w:tcPr>
           <w:p>
-            <w:pPr>
-              <w:jc w:val="center"/>
-            </w:pPr>
             <w:r>
-              <w:rPr>
-                <w:rFonts w:ascii="Microsoft YaHei" w:hAnsi="Microsoft YaHei" w:eastAsia="Microsoft YaHei"/>
-                <w:sz w:val="18"/>
-              </w:rPr>
               <w:t>50</w:t>
             </w:r>
           </w:p>
@@ -1938,14 +1385,7 @@
             <w:tcW w:type="dxa" w:w="2160"/>
           </w:tcPr>
           <w:p>
-            <w:pPr>
-              <w:jc w:val="center"/>
-            </w:pPr>
             <w:r>
-              <w:rPr>
-                <w:rFonts w:ascii="Microsoft YaHei" w:hAnsi="Microsoft YaHei" w:eastAsia="Microsoft YaHei"/>
-                <w:sz w:val="18"/>
-              </w:rPr>
               <w:t>0.2011</w:t>
             </w:r>
           </w:p>
@@ -1955,14 +1395,7 @@
             <w:tcW w:type="dxa" w:w="2160"/>
           </w:tcPr>
           <w:p>
-            <w:pPr>
-              <w:jc w:val="center"/>
-            </w:pPr>
             <w:r>
-              <w:rPr>
-                <w:rFonts w:ascii="Microsoft YaHei" w:hAnsi="Microsoft YaHei" w:eastAsia="Microsoft YaHei"/>
-                <w:sz w:val="18"/>
-              </w:rPr>
               <w:t>0.550</w:t>
             </w:r>
           </w:p>
@@ -1972,14 +1405,7 @@
             <w:tcW w:type="dxa" w:w="2160"/>
           </w:tcPr>
           <w:p>
-            <w:pPr>
-              <w:jc w:val="center"/>
-            </w:pPr>
             <w:r>
-              <w:rPr>
-                <w:rFonts w:ascii="Microsoft YaHei" w:hAnsi="Microsoft YaHei" w:eastAsia="Microsoft YaHei"/>
-                <w:sz w:val="18"/>
-              </w:rPr>
               <w:t>+4.7%</w:t>
             </w:r>
           </w:p>
@@ -1991,14 +1417,7 @@
             <w:tcW w:type="dxa" w:w="2160"/>
           </w:tcPr>
           <w:p>
-            <w:pPr>
-              <w:jc w:val="center"/>
-            </w:pPr>
             <w:r>
-              <w:rPr>
-                <w:rFonts w:ascii="Microsoft YaHei" w:hAnsi="Microsoft YaHei" w:eastAsia="Microsoft YaHei"/>
-                <w:sz w:val="18"/>
-              </w:rPr>
               <w:t>80</w:t>
             </w:r>
           </w:p>
@@ -2008,14 +1427,7 @@
             <w:tcW w:type="dxa" w:w="2160"/>
           </w:tcPr>
           <w:p>
-            <w:pPr>
-              <w:jc w:val="center"/>
-            </w:pPr>
             <w:r>
-              <w:rPr>
-                <w:rFonts w:ascii="Microsoft YaHei" w:hAnsi="Microsoft YaHei" w:eastAsia="Microsoft YaHei"/>
-                <w:sz w:val="18"/>
-              </w:rPr>
               <w:t>0.1975</w:t>
             </w:r>
           </w:p>
@@ -2025,14 +1437,7 @@
             <w:tcW w:type="dxa" w:w="2160"/>
           </w:tcPr>
           <w:p>
-            <w:pPr>
-              <w:jc w:val="center"/>
-            </w:pPr>
             <w:r>
-              <w:rPr>
-                <w:rFonts w:ascii="Microsoft YaHei" w:hAnsi="Microsoft YaHei" w:eastAsia="Microsoft YaHei"/>
-                <w:sz w:val="18"/>
-              </w:rPr>
               <w:t>0.550</w:t>
             </w:r>
           </w:p>
@@ -2042,14 +1447,7 @@
             <w:tcW w:type="dxa" w:w="2160"/>
           </w:tcPr>
           <w:p>
-            <w:pPr>
-              <w:jc w:val="center"/>
-            </w:pPr>
             <w:r>
-              <w:rPr>
-                <w:rFonts w:ascii="Microsoft YaHei" w:hAnsi="Microsoft YaHei" w:eastAsia="Microsoft YaHei"/>
-                <w:sz w:val="18"/>
-              </w:rPr>
               <w:t>+2.7%</w:t>
             </w:r>
           </w:p>
@@ -2061,14 +1459,7 @@
             <w:tcW w:type="dxa" w:w="2160"/>
           </w:tcPr>
           <w:p>
-            <w:pPr>
-              <w:jc w:val="center"/>
-            </w:pPr>
             <w:r>
-              <w:rPr>
-                <w:rFonts w:ascii="Microsoft YaHei" w:hAnsi="Microsoft YaHei" w:eastAsia="Microsoft YaHei"/>
-                <w:sz w:val="18"/>
-              </w:rPr>
               <w:t>120</w:t>
             </w:r>
           </w:p>
@@ -2078,14 +1469,7 @@
             <w:tcW w:type="dxa" w:w="2160"/>
           </w:tcPr>
           <w:p>
-            <w:pPr>
-              <w:jc w:val="center"/>
-            </w:pPr>
             <w:r>
-              <w:rPr>
-                <w:rFonts w:ascii="Microsoft YaHei" w:hAnsi="Microsoft YaHei" w:eastAsia="Microsoft YaHei"/>
-                <w:sz w:val="18"/>
-              </w:rPr>
               <w:t>0.1944</w:t>
             </w:r>
           </w:p>
@@ -2095,14 +1479,7 @@
             <w:tcW w:type="dxa" w:w="2160"/>
           </w:tcPr>
           <w:p>
-            <w:pPr>
-              <w:jc w:val="center"/>
-            </w:pPr>
             <w:r>
-              <w:rPr>
-                <w:rFonts w:ascii="Microsoft YaHei" w:hAnsi="Microsoft YaHei" w:eastAsia="Microsoft YaHei"/>
-                <w:sz w:val="18"/>
-              </w:rPr>
               <w:t>0.550</w:t>
             </w:r>
           </w:p>
@@ -2112,14 +1489,7 @@
             <w:tcW w:type="dxa" w:w="2160"/>
           </w:tcPr>
           <w:p>
-            <w:pPr>
-              <w:jc w:val="center"/>
-            </w:pPr>
             <w:r>
-              <w:rPr>
-                <w:rFonts w:ascii="Microsoft YaHei" w:hAnsi="Microsoft YaHei" w:eastAsia="Microsoft YaHei"/>
-                <w:sz w:val="18"/>
-              </w:rPr>
               <w:t>+1.1%</w:t>
             </w:r>
           </w:p>
@@ -2131,14 +1501,7 @@
             <w:tcW w:type="dxa" w:w="2160"/>
           </w:tcPr>
           <w:p>
-            <w:pPr>
-              <w:jc w:val="center"/>
-            </w:pPr>
             <w:r>
-              <w:rPr>
-                <w:rFonts w:ascii="Microsoft YaHei" w:hAnsi="Microsoft YaHei" w:eastAsia="Microsoft YaHei"/>
-                <w:sz w:val="18"/>
-              </w:rPr>
               <w:t>200</w:t>
             </w:r>
           </w:p>
@@ -2148,14 +1511,7 @@
             <w:tcW w:type="dxa" w:w="2160"/>
           </w:tcPr>
           <w:p>
-            <w:pPr>
-              <w:jc w:val="center"/>
-            </w:pPr>
             <w:r>
-              <w:rPr>
-                <w:rFonts w:ascii="Microsoft YaHei" w:hAnsi="Microsoft YaHei" w:eastAsia="Microsoft YaHei"/>
-                <w:sz w:val="18"/>
-              </w:rPr>
               <w:t>0.1922</w:t>
             </w:r>
           </w:p>
@@ -2165,14 +1521,7 @@
             <w:tcW w:type="dxa" w:w="2160"/>
           </w:tcPr>
           <w:p>
-            <w:pPr>
-              <w:jc w:val="center"/>
-            </w:pPr>
             <w:r>
-              <w:rPr>
-                <w:rFonts w:ascii="Microsoft YaHei" w:hAnsi="Microsoft YaHei" w:eastAsia="Microsoft YaHei"/>
-                <w:sz w:val="18"/>
-              </w:rPr>
               <w:t>0.550</w:t>
             </w:r>
           </w:p>
@@ -2182,14 +1531,7 @@
             <w:tcW w:type="dxa" w:w="2160"/>
           </w:tcPr>
           <w:p>
-            <w:pPr>
-              <w:jc w:val="center"/>
-            </w:pPr>
             <w:r>
-              <w:rPr>
-                <w:rFonts w:ascii="Microsoft YaHei" w:hAnsi="Microsoft YaHei" w:eastAsia="Microsoft YaHei"/>
-                <w:sz w:val="18"/>
-              </w:rPr>
               <w:t>基准</w:t>
             </w:r>
           </w:p>
@@ -2209,53 +1551,27 @@
     </w:p>
     <w:p>
       <w:r>
-        <w:rPr>
-          <w:rFonts w:ascii="Microsoft YaHei" w:hAnsi="Microsoft YaHei" w:eastAsia="Microsoft YaHei"/>
-          <w:b w:val="0"/>
-          <w:sz w:val="21"/>
-        </w:rPr>
-        <w:t>① N_p → ∞ 时 MPC 趋近于"全局 ECMS"（带等效因子的全局优化），氢耗继续降低。</w:t>
+        <w:t>① 当前实现是“预测期内恒定 P_fc”的简化 MPC，不是完整的未来控制序列优化。</w:t>
       </w:r>
     </w:p>
     <w:p>
       <w:r>
-        <w:rPr>
-          <w:rFonts w:ascii="Microsoft YaHei" w:hAnsi="Microsoft YaHei" w:eastAsia="Microsoft YaHei"/>
-          <w:b w:val="0"/>
-          <w:sz w:val="21"/>
-        </w:rPr>
-        <w:t>② N_p ≥ 50 时 SOC_end 稳定在 0.550，N_p=10~20 时 SOC_end=0.533（偏差更大）。</w:t>
+        <w:t>② N_p 增大时原始氢耗下降，但这必须和 SOC_end 一起解释；若 SOC_end 更低，说明部分收益来自电池能量透支。</w:t>
       </w:r>
     </w:p>
     <w:p>
       <w:r>
-        <w:rPr>
-          <w:rFonts w:ascii="Microsoft YaHei" w:hAnsi="Microsoft YaHei" w:eastAsia="Microsoft YaHei"/>
-          <w:b w:val="0"/>
-          <w:sz w:val="21"/>
-        </w:rPr>
-        <w:t>③ 这是 MPC + 能量平衡惩罚的特殊现象：MPC 在有 s 引导时等价于"滚动 ECMS"，N_p 越大越接近全局最优的 s 分配。</w:t>
+        <w:t>③ 因此不能写“N_p→∞ 时趋近 DP/全局 ECMS”；只能写“在当前简化策略和当前代价函数下，N_p 增大改善了滚动搜索结果”。</w:t>
       </w:r>
     </w:p>
     <w:p>
       <w:r>
-        <w:rPr>
-          <w:rFonts w:ascii="Microsoft YaHei" w:hAnsi="Microsoft YaHei" w:eastAsia="Microsoft YaHei"/>
-          <w:b w:val="0"/>
-          <w:sz w:val="21"/>
-        </w:rPr>
-        <w:t>④ 经验建议：N_p ≈ 30~60 时性价比最优，覆盖典型功率波动周期。</w:t>
+        <w:t>④ 优化版扫描应同时画 H2_raw 与 H2_eq：若 H2_raw 下降但 H2_eq 不降，就不能解释为真实节氢。</w:t>
       </w:r>
     </w:p>
     <w:p>
       <w:r>
-        <w:rPr>
-          <w:rFonts w:ascii="Microsoft YaHei" w:hAnsi="Microsoft YaHei" w:eastAsia="Microsoft YaHei"/>
-          <w:b/>
-          <w:color w:val="008000"/>
-          <w:sz w:val="21"/>
-        </w:rPr>
-        <w:t>✅ 通过 N_p=50 是合理选择，兼顾性能和计算量。</w:t>
+        <w:t>⚠️ 需关注 N_p=50 可作为当前实验点；第8周用优化版 SOC 修正指标重新确认。</w:t>
       </w:r>
     </w:p>
     <w:p>
@@ -2299,15 +1615,7 @@
             <w:tcW w:type="dxa" w:w="1728"/>
           </w:tcPr>
           <w:p>
-            <w:pPr>
-              <w:jc w:val="center"/>
-            </w:pPr>
             <w:r>
-              <w:rPr>
-                <w:rFonts w:ascii="Microsoft YaHei" w:hAnsi="Microsoft YaHei" w:eastAsia="Microsoft YaHei"/>
-                <w:b/>
-                <w:sz w:val="19"/>
-              </w:rPr>
               <w:t>指标</w:t>
             </w:r>
           </w:p>
@@ -2317,15 +1625,7 @@
             <w:tcW w:type="dxa" w:w="1728"/>
           </w:tcPr>
           <w:p>
-            <w:pPr>
-              <w:jc w:val="center"/>
-            </w:pPr>
             <w:r>
-              <w:rPr>
-                <w:rFonts w:ascii="Microsoft YaHei" w:hAnsi="Microsoft YaHei" w:eastAsia="Microsoft YaHei"/>
-                <w:b/>
-                <w:sz w:val="19"/>
-              </w:rPr>
               <w:t>规则控制器</w:t>
             </w:r>
           </w:p>
@@ -2335,15 +1635,7 @@
             <w:tcW w:type="dxa" w:w="1728"/>
           </w:tcPr>
           <w:p>
-            <w:pPr>
-              <w:jc w:val="center"/>
-            </w:pPr>
             <w:r>
-              <w:rPr>
-                <w:rFonts w:ascii="Microsoft YaHei" w:hAnsi="Microsoft YaHei" w:eastAsia="Microsoft YaHei"/>
-                <w:b/>
-                <w:sz w:val="19"/>
-              </w:rPr>
               <w:t>DP</w:t>
             </w:r>
           </w:p>
@@ -2353,15 +1645,7 @@
             <w:tcW w:type="dxa" w:w="1728"/>
           </w:tcPr>
           <w:p>
-            <w:pPr>
-              <w:jc w:val="center"/>
-            </w:pPr>
             <w:r>
-              <w:rPr>
-                <w:rFonts w:ascii="Microsoft YaHei" w:hAnsi="Microsoft YaHei" w:eastAsia="Microsoft YaHei"/>
-                <w:b/>
-                <w:sz w:val="19"/>
-              </w:rPr>
               <w:t>ECMS (s=130)</w:t>
             </w:r>
           </w:p>
@@ -2371,15 +1655,7 @@
             <w:tcW w:type="dxa" w:w="1728"/>
           </w:tcPr>
           <w:p>
-            <w:pPr>
-              <w:jc w:val="center"/>
-            </w:pPr>
             <w:r>
-              <w:rPr>
-                <w:rFonts w:ascii="Microsoft YaHei" w:hAnsi="Microsoft YaHei" w:eastAsia="Microsoft YaHei"/>
-                <w:b/>
-                <w:sz w:val="19"/>
-              </w:rPr>
               <w:t>MPC (N_p=50)</w:t>
             </w:r>
           </w:p>
@@ -2391,14 +1667,7 @@
             <w:tcW w:type="dxa" w:w="1728"/>
           </w:tcPr>
           <w:p>
-            <w:pPr>
-              <w:jc w:val="center"/>
-            </w:pPr>
             <w:r>
-              <w:rPr>
-                <w:rFonts w:ascii="Microsoft YaHei" w:hAnsi="Microsoft YaHei" w:eastAsia="Microsoft YaHei"/>
-                <w:sz w:val="18"/>
-              </w:rPr>
               <w:t>总氢耗 (kg)</w:t>
             </w:r>
           </w:p>
@@ -2408,14 +1677,7 @@
             <w:tcW w:type="dxa" w:w="1728"/>
           </w:tcPr>
           <w:p>
-            <w:pPr>
-              <w:jc w:val="center"/>
-            </w:pPr>
             <w:r>
-              <w:rPr>
-                <w:rFonts w:ascii="Microsoft YaHei" w:hAnsi="Microsoft YaHei" w:eastAsia="Microsoft YaHei"/>
-                <w:sz w:val="18"/>
-              </w:rPr>
               <w:t>0.1444</w:t>
             </w:r>
           </w:p>
@@ -2425,14 +1687,7 @@
             <w:tcW w:type="dxa" w:w="1728"/>
           </w:tcPr>
           <w:p>
-            <w:pPr>
-              <w:jc w:val="center"/>
-            </w:pPr>
             <w:r>
-              <w:rPr>
-                <w:rFonts w:ascii="Microsoft YaHei" w:hAnsi="Microsoft YaHei" w:eastAsia="Microsoft YaHei"/>
-                <w:sz w:val="18"/>
-              </w:rPr>
               <w:t>0.0990</w:t>
             </w:r>
           </w:p>
@@ -2442,14 +1697,7 @@
             <w:tcW w:type="dxa" w:w="1728"/>
           </w:tcPr>
           <w:p>
-            <w:pPr>
-              <w:jc w:val="center"/>
-            </w:pPr>
             <w:r>
-              <w:rPr>
-                <w:rFonts w:ascii="Microsoft YaHei" w:hAnsi="Microsoft YaHei" w:eastAsia="Microsoft YaHei"/>
-                <w:sz w:val="18"/>
-              </w:rPr>
               <w:t>0.1034</w:t>
             </w:r>
           </w:p>
@@ -2459,15 +1707,8 @@
             <w:tcW w:type="dxa" w:w="1728"/>
           </w:tcPr>
           <w:p>
-            <w:pPr>
-              <w:jc w:val="center"/>
-            </w:pPr>
             <w:r>
-              <w:rPr>
-                <w:rFonts w:ascii="Microsoft YaHei" w:hAnsi="Microsoft YaHei" w:eastAsia="Microsoft YaHei"/>
-                <w:sz w:val="18"/>
-              </w:rPr>
-              <w:t>0.0481</w:t>
+              <w:t>0.0812</w:t>
             </w:r>
           </w:p>
         </w:tc>
@@ -2478,14 +1719,7 @@
             <w:tcW w:type="dxa" w:w="1728"/>
           </w:tcPr>
           <w:p>
-            <w:pPr>
-              <w:jc w:val="center"/>
-            </w:pPr>
             <w:r>
-              <w:rPr>
-                <w:rFonts w:ascii="Microsoft YaHei" w:hAnsi="Microsoft YaHei" w:eastAsia="Microsoft YaHei"/>
-                <w:sz w:val="18"/>
-              </w:rPr>
               <w:t>相对 DP 差距</w:t>
             </w:r>
           </w:p>
@@ -2495,14 +1729,7 @@
             <w:tcW w:type="dxa" w:w="1728"/>
           </w:tcPr>
           <w:p>
-            <w:pPr>
-              <w:jc w:val="center"/>
-            </w:pPr>
             <w:r>
-              <w:rPr>
-                <w:rFonts w:ascii="Microsoft YaHei" w:hAnsi="Microsoft YaHei" w:eastAsia="Microsoft YaHei"/>
-                <w:sz w:val="18"/>
-              </w:rPr>
               <w:t>+45.9%</w:t>
             </w:r>
           </w:p>
@@ -2512,14 +1739,7 @@
             <w:tcW w:type="dxa" w:w="1728"/>
           </w:tcPr>
           <w:p>
-            <w:pPr>
-              <w:jc w:val="center"/>
-            </w:pPr>
             <w:r>
-              <w:rPr>
-                <w:rFonts w:ascii="Microsoft YaHei" w:hAnsi="Microsoft YaHei" w:eastAsia="Microsoft YaHei"/>
-                <w:sz w:val="18"/>
-              </w:rPr>
               <w:t>基准</w:t>
             </w:r>
           </w:p>
@@ -2529,14 +1749,7 @@
             <w:tcW w:type="dxa" w:w="1728"/>
           </w:tcPr>
           <w:p>
-            <w:pPr>
-              <w:jc w:val="center"/>
-            </w:pPr>
             <w:r>
-              <w:rPr>
-                <w:rFonts w:ascii="Microsoft YaHei" w:hAnsi="Microsoft YaHei" w:eastAsia="Microsoft YaHei"/>
-                <w:sz w:val="18"/>
-              </w:rPr>
               <w:t>+4.5%</w:t>
             </w:r>
           </w:p>
@@ -2546,15 +1759,8 @@
             <w:tcW w:type="dxa" w:w="1728"/>
           </w:tcPr>
           <w:p>
-            <w:pPr>
-              <w:jc w:val="center"/>
-            </w:pPr>
             <w:r>
-              <w:rPr>
-                <w:rFonts w:ascii="Microsoft YaHei" w:hAnsi="Microsoft YaHei" w:eastAsia="Microsoft YaHei"/>
-                <w:sz w:val="18"/>
-              </w:rPr>
-              <w:t>+-51.4%</w:t>
+              <w:t>-18.0%（优化版原始；需结合 H2_eq）</w:t>
             </w:r>
           </w:p>
         </w:tc>
@@ -2565,14 +1771,7 @@
             <w:tcW w:type="dxa" w:w="1728"/>
           </w:tcPr>
           <w:p>
-            <w:pPr>
-              <w:jc w:val="center"/>
-            </w:pPr>
             <w:r>
-              <w:rPr>
-                <w:rFonts w:ascii="Microsoft YaHei" w:hAnsi="Microsoft YaHei" w:eastAsia="Microsoft YaHei"/>
-                <w:sz w:val="18"/>
-              </w:rPr>
               <w:t>SOC 初→终</w:t>
             </w:r>
           </w:p>
@@ -2582,14 +1781,7 @@
             <w:tcW w:type="dxa" w:w="1728"/>
           </w:tcPr>
           <w:p>
-            <w:pPr>
-              <w:jc w:val="center"/>
-            </w:pPr>
             <w:r>
-              <w:rPr>
-                <w:rFonts w:ascii="Microsoft YaHei" w:hAnsi="Microsoft YaHei" w:eastAsia="Microsoft YaHei"/>
-                <w:sz w:val="18"/>
-              </w:rPr>
               <w:t>0.60→0.621</w:t>
             </w:r>
           </w:p>
@@ -2599,14 +1791,7 @@
             <w:tcW w:type="dxa" w:w="1728"/>
           </w:tcPr>
           <w:p>
-            <w:pPr>
-              <w:jc w:val="center"/>
-            </w:pPr>
             <w:r>
-              <w:rPr>
-                <w:rFonts w:ascii="Microsoft YaHei" w:hAnsi="Microsoft YaHei" w:eastAsia="Microsoft YaHei"/>
-                <w:sz w:val="18"/>
-              </w:rPr>
               <w:t>0.60→0.574</w:t>
             </w:r>
           </w:p>
@@ -2616,14 +1801,7 @@
             <w:tcW w:type="dxa" w:w="1728"/>
           </w:tcPr>
           <w:p>
-            <w:pPr>
-              <w:jc w:val="center"/>
-            </w:pPr>
             <w:r>
-              <w:rPr>
-                <w:rFonts w:ascii="Microsoft YaHei" w:hAnsi="Microsoft YaHei" w:eastAsia="Microsoft YaHei"/>
-                <w:sz w:val="18"/>
-              </w:rPr>
               <w:t>0.60→0.596</w:t>
             </w:r>
           </w:p>
@@ -2633,15 +1811,60 @@
             <w:tcW w:type="dxa" w:w="1728"/>
           </w:tcPr>
           <w:p>
-            <w:pPr>
-              <w:jc w:val="center"/>
-            </w:pPr>
             <w:r>
-              <w:rPr>
-                <w:rFonts w:ascii="Microsoft YaHei" w:hAnsi="Microsoft YaHei" w:eastAsia="Microsoft YaHei"/>
-                <w:sz w:val="18"/>
-              </w:rPr>
-              <w:t>0.60→0.550</w:t>
+              <w:t>0.60→0.574</w:t>
+            </w:r>
+          </w:p>
+        </w:tc>
+      </w:tr>
+      <w:tr>
+        <w:tc>
+          <w:tcPr>
+            <w:tcW w:type="dxa" w:w="1728"/>
+          </w:tcPr>
+          <w:p>
+            <w:r>
+              <w:t>公平比较口径</w:t>
+            </w:r>
+          </w:p>
+        </w:tc>
+        <w:tc>
+          <w:tcPr>
+            <w:tcW w:type="dxa" w:w="1728"/>
+          </w:tcPr>
+          <w:p>
+            <w:r>
+              <w:t>需看 H2_eq</w:t>
+            </w:r>
+          </w:p>
+        </w:tc>
+        <w:tc>
+          <w:tcPr>
+            <w:tcW w:type="dxa" w:w="1728"/>
+          </w:tcPr>
+          <w:p>
+            <w:r>
+              <w:t>基准</w:t>
+            </w:r>
+          </w:p>
+        </w:tc>
+        <w:tc>
+          <w:tcPr>
+            <w:tcW w:type="dxa" w:w="1728"/>
+          </w:tcPr>
+          <w:p>
+            <w:r>
+              <w:t>需看 H2_eq</w:t>
+            </w:r>
+          </w:p>
+        </w:tc>
+        <w:tc>
+          <w:tcPr>
+            <w:tcW w:type="dxa" w:w="1728"/>
+          </w:tcPr>
+          <w:p>
+            <w:r>
+              <w:t>H2_eq=0.1403 kg</w:t>
             </w:r>
           </w:p>
         </w:tc>
@@ -2658,12 +1881,7 @@
     </w:p>
     <w:p>
       <w:r>
-        <w:rPr>
-          <w:rFonts w:ascii="Microsoft YaHei" w:hAnsi="Microsoft YaHei" w:eastAsia="Microsoft YaHei"/>
-          <w:b w:val="0"/>
-          <w:sz w:val="21"/>
-        </w:rPr>
-        <w:t>NEDC 上 MPC 比 DP 高约 +14%，主要因为 NEDC 功率较低，MPC 更容易过度依赖电池。但在实际应用中，ECMS 在 NEDC 上仅 +4.5%，表现稳定。</w:t>
+        <w:t>NEDC 上 MPC 比 DP 高约 +14%，说明同一组 N_p/s/终端惩罚不能稳定泛化到所有工况。ECMS 在 NEDC 上 +4.5%，表现更稳定。</w:t>
       </w:r>
     </w:p>
     <w:p>
@@ -2721,12 +1939,7 @@
     </w:p>
     <w:p>
       <w:r>
-        <w:rPr>
-          <w:rFonts w:ascii="Microsoft YaHei" w:hAnsi="Microsoft YaHei" w:eastAsia="Microsoft YaHei"/>
-          <w:b w:val="0"/>
-          <w:sz w:val="21"/>
-        </w:rPr>
-        <w:t>修复：在代价函数中加入 s×|P_bat|/3600 的能量平衡惩罚，s 取自 ECMS 最优值 130 g/kWh。</w:t>
+        <w:t>修复：在代价函数中加入 s×|P_bat|/3600 的能量平衡惩罚，s 取自 ECMS 最优值 130 g/kWh。进一步修正：若候选控制导致电池模型无实数解或 SOC 越界，应直接剔除候选，而不是用 clip 悄悄拉回边界。优化更新：终端 SOC 惩罚改为滚动窗口全程生效，并加入 SOC 软下限、真实终点 SOC 欠差惩罚和 FC 功率变化惩罚。</w:t>
       </w:r>
     </w:p>
     <w:p>
@@ -2839,15 +2052,7 @@
             <w:tcW w:type="dxa" w:w="2160"/>
           </w:tcPr>
           <w:p>
-            <w:pPr>
-              <w:jc w:val="center"/>
-            </w:pPr>
             <w:r>
-              <w:rPr>
-                <w:rFonts w:ascii="Microsoft YaHei" w:hAnsi="Microsoft YaHei" w:eastAsia="Microsoft YaHei"/>
-                <w:b/>
-                <w:sz w:val="19"/>
-              </w:rPr>
               <w:t>方法</w:t>
             </w:r>
           </w:p>
@@ -2857,15 +2062,7 @@
             <w:tcW w:type="dxa" w:w="2160"/>
           </w:tcPr>
           <w:p>
-            <w:pPr>
-              <w:jc w:val="center"/>
-            </w:pPr>
             <w:r>
-              <w:rPr>
-                <w:rFonts w:ascii="Microsoft YaHei" w:hAnsi="Microsoft YaHei" w:eastAsia="Microsoft YaHei"/>
-                <w:b/>
-                <w:sz w:val="19"/>
-              </w:rPr>
               <w:t>λ = ?</w:t>
             </w:r>
           </w:p>
@@ -2875,15 +2072,7 @@
             <w:tcW w:type="dxa" w:w="2160"/>
           </w:tcPr>
           <w:p>
-            <w:pPr>
-              <w:jc w:val="center"/>
-            </w:pPr>
             <w:r>
-              <w:rPr>
-                <w:rFonts w:ascii="Microsoft YaHei" w:hAnsi="Microsoft YaHei" w:eastAsia="Microsoft YaHei"/>
-                <w:b/>
-                <w:sz w:val="19"/>
-              </w:rPr>
               <w:t>计算方式</w:t>
             </w:r>
           </w:p>
@@ -2893,15 +2082,7 @@
             <w:tcW w:type="dxa" w:w="2160"/>
           </w:tcPr>
           <w:p>
-            <w:pPr>
-              <w:jc w:val="center"/>
-            </w:pPr>
             <w:r>
-              <w:rPr>
-                <w:rFonts w:ascii="Microsoft YaHei" w:hAnsi="Microsoft YaHei" w:eastAsia="Microsoft YaHei"/>
-                <w:b/>
-                <w:sz w:val="19"/>
-              </w:rPr>
               <w:t>实时性</w:t>
             </w:r>
           </w:p>
@@ -2913,14 +2094,7 @@
             <w:tcW w:type="dxa" w:w="2160"/>
           </w:tcPr>
           <w:p>
-            <w:pPr>
-              <w:jc w:val="center"/>
-            </w:pPr>
             <w:r>
-              <w:rPr>
-                <w:rFonts w:ascii="Microsoft YaHei" w:hAnsi="Microsoft YaHei" w:eastAsia="Microsoft YaHei"/>
-                <w:sz w:val="18"/>
-              </w:rPr>
               <w:t>DP</w:t>
             </w:r>
           </w:p>
@@ -2930,14 +2104,7 @@
             <w:tcW w:type="dxa" w:w="2160"/>
           </w:tcPr>
           <w:p>
-            <w:pPr>
-              <w:jc w:val="center"/>
-            </w:pPr>
             <w:r>
-              <w:rPr>
-                <w:rFonts w:ascii="Microsoft YaHei" w:hAnsi="Microsoft YaHei" w:eastAsia="Microsoft YaHei"/>
-                <w:sz w:val="18"/>
-              </w:rPr>
               <w:t>∂J*/∂SOC</w:t>
             </w:r>
           </w:p>
@@ -2947,14 +2114,7 @@
             <w:tcW w:type="dxa" w:w="2160"/>
           </w:tcPr>
           <w:p>
-            <w:pPr>
-              <w:jc w:val="center"/>
-            </w:pPr>
             <w:r>
-              <w:rPr>
-                <w:rFonts w:ascii="Microsoft YaHei" w:hAnsi="Microsoft YaHei" w:eastAsia="Microsoft YaHei"/>
-                <w:sz w:val="18"/>
-              </w:rPr>
               <w:t>后向递推（离线）</w:t>
             </w:r>
           </w:p>
@@ -2964,14 +2124,7 @@
             <w:tcW w:type="dxa" w:w="2160"/>
           </w:tcPr>
           <w:p>
-            <w:pPr>
-              <w:jc w:val="center"/>
-            </w:pPr>
             <w:r>
-              <w:rPr>
-                <w:rFonts w:ascii="Microsoft YaHei" w:hAnsi="Microsoft YaHei" w:eastAsia="Microsoft YaHei"/>
-                <w:sz w:val="18"/>
-              </w:rPr>
               <w:t>❌ 离线</w:t>
             </w:r>
           </w:p>
@@ -2983,14 +2136,7 @@
             <w:tcW w:type="dxa" w:w="2160"/>
           </w:tcPr>
           <w:p>
-            <w:pPr>
-              <w:jc w:val="center"/>
-            </w:pPr>
             <w:r>
-              <w:rPr>
-                <w:rFonts w:ascii="Microsoft YaHei" w:hAnsi="Microsoft YaHei" w:eastAsia="Microsoft YaHei"/>
-                <w:sz w:val="18"/>
-              </w:rPr>
               <w:t>MPC</w:t>
             </w:r>
           </w:p>
@@ -3000,14 +2146,7 @@
             <w:tcW w:type="dxa" w:w="2160"/>
           </w:tcPr>
           <w:p>
-            <w:pPr>
-              <w:jc w:val="center"/>
-            </w:pPr>
             <w:r>
-              <w:rPr>
-                <w:rFonts w:ascii="Microsoft YaHei" w:hAnsi="Microsoft YaHei" w:eastAsia="Microsoft YaHei"/>
-                <w:sz w:val="18"/>
-              </w:rPr>
               <w:t>∂V/∂SOC</w:t>
             </w:r>
           </w:p>
@@ -3017,14 +2156,7 @@
             <w:tcW w:type="dxa" w:w="2160"/>
           </w:tcPr>
           <w:p>
-            <w:pPr>
-              <w:jc w:val="center"/>
-            </w:pPr>
             <w:r>
-              <w:rPr>
-                <w:rFonts w:ascii="Microsoft YaHei" w:hAnsi="Microsoft YaHei" w:eastAsia="Microsoft YaHei"/>
-                <w:sz w:val="18"/>
-              </w:rPr>
               <w:t>终端代价梯度（在线滚动）</w:t>
             </w:r>
           </w:p>
@@ -3034,14 +2166,7 @@
             <w:tcW w:type="dxa" w:w="2160"/>
           </w:tcPr>
           <w:p>
-            <w:pPr>
-              <w:jc w:val="center"/>
-            </w:pPr>
             <w:r>
-              <w:rPr>
-                <w:rFonts w:ascii="Microsoft YaHei" w:hAnsi="Microsoft YaHei" w:eastAsia="Microsoft YaHei"/>
-                <w:sz w:val="18"/>
-              </w:rPr>
               <w:t>⚠️ 需预测</w:t>
             </w:r>
           </w:p>
@@ -3053,14 +2178,7 @@
             <w:tcW w:type="dxa" w:w="2160"/>
           </w:tcPr>
           <w:p>
-            <w:pPr>
-              <w:jc w:val="center"/>
-            </w:pPr>
             <w:r>
-              <w:rPr>
-                <w:rFonts w:ascii="Microsoft YaHei" w:hAnsi="Microsoft YaHei" w:eastAsia="Microsoft YaHei"/>
-                <w:sz w:val="18"/>
-              </w:rPr>
               <w:t>ECMS</w:t>
             </w:r>
           </w:p>
@@ -3070,14 +2188,7 @@
             <w:tcW w:type="dxa" w:w="2160"/>
           </w:tcPr>
           <w:p>
-            <w:pPr>
-              <w:jc w:val="center"/>
-            </w:pPr>
             <w:r>
-              <w:rPr>
-                <w:rFonts w:ascii="Microsoft YaHei" w:hAnsi="Microsoft YaHei" w:eastAsia="Microsoft YaHei"/>
-                <w:sz w:val="18"/>
-              </w:rPr>
               <w:t>s (常数)</w:t>
             </w:r>
           </w:p>
@@ -3087,14 +2198,7 @@
             <w:tcW w:type="dxa" w:w="2160"/>
           </w:tcPr>
           <w:p>
-            <w:pPr>
-              <w:jc w:val="center"/>
-            </w:pPr>
             <w:r>
-              <w:rPr>
-                <w:rFonts w:ascii="Microsoft YaHei" w:hAnsi="Microsoft YaHei" w:eastAsia="Microsoft YaHei"/>
-                <w:sz w:val="18"/>
-              </w:rPr>
               <w:t>离线标定 + 扫描</w:t>
             </w:r>
           </w:p>
@@ -3104,14 +2208,7 @@
             <w:tcW w:type="dxa" w:w="2160"/>
           </w:tcPr>
           <w:p>
-            <w:pPr>
-              <w:jc w:val="center"/>
-            </w:pPr>
             <w:r>
-              <w:rPr>
-                <w:rFonts w:ascii="Microsoft YaHei" w:hAnsi="Microsoft YaHei" w:eastAsia="Microsoft YaHei"/>
-                <w:sz w:val="18"/>
-              </w:rPr>
               <w:t>✅ 实时</w:t>
             </w:r>
           </w:p>
@@ -3123,14 +2220,7 @@
             <w:tcW w:type="dxa" w:w="2160"/>
           </w:tcPr>
           <w:p>
-            <w:pPr>
-              <w:jc w:val="center"/>
-            </w:pPr>
             <w:r>
-              <w:rPr>
-                <w:rFonts w:ascii="Microsoft YaHei" w:hAnsi="Microsoft YaHei" w:eastAsia="Microsoft YaHei"/>
-                <w:sz w:val="18"/>
-              </w:rPr>
               <w:t>A-ECMS</w:t>
             </w:r>
           </w:p>
@@ -3140,14 +2230,7 @@
             <w:tcW w:type="dxa" w:w="2160"/>
           </w:tcPr>
           <w:p>
-            <w:pPr>
-              <w:jc w:val="center"/>
-            </w:pPr>
             <w:r>
-              <w:rPr>
-                <w:rFonts w:ascii="Microsoft YaHei" w:hAnsi="Microsoft YaHei" w:eastAsia="Microsoft YaHei"/>
-                <w:sz w:val="18"/>
-              </w:rPr>
               <w:t>s(k) = s₀(1+KpΔSOC)</w:t>
             </w:r>
           </w:p>
@@ -3157,14 +2240,7 @@
             <w:tcW w:type="dxa" w:w="2160"/>
           </w:tcPr>
           <w:p>
-            <w:pPr>
-              <w:jc w:val="center"/>
-            </w:pPr>
             <w:r>
-              <w:rPr>
-                <w:rFonts w:ascii="Microsoft YaHei" w:hAnsi="Microsoft YaHei" w:eastAsia="Microsoft YaHei"/>
-                <w:sz w:val="18"/>
-              </w:rPr>
               <w:t>SOC 反馈自适应</w:t>
             </w:r>
           </w:p>
@@ -3174,14 +2250,7 @@
             <w:tcW w:type="dxa" w:w="2160"/>
           </w:tcPr>
           <w:p>
-            <w:pPr>
-              <w:jc w:val="center"/>
-            </w:pPr>
             <w:r>
-              <w:rPr>
-                <w:rFonts w:ascii="Microsoft YaHei" w:hAnsi="Microsoft YaHei" w:eastAsia="Microsoft YaHei"/>
-                <w:sz w:val="18"/>
-              </w:rPr>
               <w:t>✅ 实时</w:t>
             </w:r>
           </w:p>
@@ -3271,12 +2340,7 @@
     </w:p>
     <w:p>
       <w:r>
-        <w:rPr>
-          <w:rFonts w:ascii="Microsoft YaHei" w:hAnsi="Microsoft YaHei" w:eastAsia="Microsoft YaHei"/>
-          <w:b w:val="0"/>
-          <w:sz w:val="21"/>
-        </w:rPr>
-        <w:t xml:space="preserve">  • 在已知工况下表现优异</w:t>
+        <w:t>• 在已知工况下可以完成滚动优化；优化版加入 SOC 软约束和功率变化惩罚后，更适合做公平对比和工程化叙事</w:t>
       </w:r>
     </w:p>
     <w:p>
@@ -3438,15 +2502,7 @@
             <w:tcW w:type="dxa" w:w="4320"/>
           </w:tcPr>
           <w:p>
-            <w:pPr>
-              <w:jc w:val="center"/>
-            </w:pPr>
             <w:r>
-              <w:rPr>
-                <w:rFonts w:ascii="Microsoft YaHei" w:hAnsi="Microsoft YaHei" w:eastAsia="Microsoft YaHei"/>
-                <w:b/>
-                <w:sz w:val="19"/>
-              </w:rPr>
               <w:t>场景</w:t>
             </w:r>
           </w:p>
@@ -3456,15 +2512,7 @@
             <w:tcW w:type="dxa" w:w="4320"/>
           </w:tcPr>
           <w:p>
-            <w:pPr>
-              <w:jc w:val="center"/>
-            </w:pPr>
             <w:r>
-              <w:rPr>
-                <w:rFonts w:ascii="Microsoft YaHei" w:hAnsi="Microsoft YaHei" w:eastAsia="Microsoft YaHei"/>
-                <w:b/>
-                <w:sz w:val="19"/>
-              </w:rPr>
               <w:t>推荐</w:t>
             </w:r>
           </w:p>
@@ -3476,14 +2524,7 @@
             <w:tcW w:type="dxa" w:w="4320"/>
           </w:tcPr>
           <w:p>
-            <w:pPr>
-              <w:jc w:val="center"/>
-            </w:pPr>
             <w:r>
-              <w:rPr>
-                <w:rFonts w:ascii="Microsoft YaHei" w:hAnsi="Microsoft YaHei" w:eastAsia="Microsoft YaHei"/>
-                <w:sz w:val="18"/>
-              </w:rPr>
               <w:t>工况可精确预测（固定路线公交）</w:t>
             </w:r>
           </w:p>
@@ -3493,14 +2534,7 @@
             <w:tcW w:type="dxa" w:w="4320"/>
           </w:tcPr>
           <w:p>
-            <w:pPr>
-              <w:jc w:val="center"/>
-            </w:pPr>
             <w:r>
-              <w:rPr>
-                <w:rFonts w:ascii="Microsoft YaHei" w:hAnsi="Microsoft YaHei" w:eastAsia="Microsoft YaHei"/>
-                <w:sz w:val="18"/>
-              </w:rPr>
               <w:t>MPC</w:t>
             </w:r>
           </w:p>
@@ -3512,14 +2546,7 @@
             <w:tcW w:type="dxa" w:w="4320"/>
           </w:tcPr>
           <w:p>
-            <w:pPr>
-              <w:jc w:val="center"/>
-            </w:pPr>
             <w:r>
-              <w:rPr>
-                <w:rFonts w:ascii="Microsoft YaHei" w:hAnsi="Microsoft YaHei" w:eastAsia="Microsoft YaHei"/>
-                <w:sz w:val="18"/>
-              </w:rPr>
               <w:t>工况随机性强（城市配送）</w:t>
             </w:r>
           </w:p>
@@ -3529,14 +2556,7 @@
             <w:tcW w:type="dxa" w:w="4320"/>
           </w:tcPr>
           <w:p>
-            <w:pPr>
-              <w:jc w:val="center"/>
-            </w:pPr>
             <w:r>
-              <w:rPr>
-                <w:rFonts w:ascii="Microsoft YaHei" w:hAnsi="Microsoft YaHei" w:eastAsia="Microsoft YaHei"/>
-                <w:sz w:val="18"/>
-              </w:rPr>
               <w:t>ECMS</w:t>
             </w:r>
           </w:p>
@@ -3548,14 +2568,7 @@
             <w:tcW w:type="dxa" w:w="4320"/>
           </w:tcPr>
           <w:p>
-            <w:pPr>
-              <w:jc w:val="center"/>
-            </w:pPr>
             <w:r>
-              <w:rPr>
-                <w:rFonts w:ascii="Microsoft YaHei" w:hAnsi="Microsoft YaHei" w:eastAsia="Microsoft YaHei"/>
-                <w:sz w:val="18"/>
-              </w:rPr>
               <w:t>算力充足 + 可加约束</w:t>
             </w:r>
           </w:p>
@@ -3565,14 +2578,7 @@
             <w:tcW w:type="dxa" w:w="4320"/>
           </w:tcPr>
           <w:p>
-            <w:pPr>
-              <w:jc w:val="center"/>
-            </w:pPr>
             <w:r>
-              <w:rPr>
-                <w:rFonts w:ascii="Microsoft YaHei" w:hAnsi="Microsoft YaHei" w:eastAsia="Microsoft YaHei"/>
-                <w:sz w:val="18"/>
-              </w:rPr>
               <w:t>MPC</w:t>
             </w:r>
           </w:p>
@@ -3584,14 +2590,7 @@
             <w:tcW w:type="dxa" w:w="4320"/>
           </w:tcPr>
           <w:p>
-            <w:pPr>
-              <w:jc w:val="center"/>
-            </w:pPr>
             <w:r>
-              <w:rPr>
-                <w:rFonts w:ascii="Microsoft YaHei" w:hAnsi="Microsoft YaHei" w:eastAsia="Microsoft YaHei"/>
-                <w:sz w:val="18"/>
-              </w:rPr>
               <w:t>算力有限 + 鲁棒性优先</w:t>
             </w:r>
           </w:p>
@@ -3601,14 +2600,7 @@
             <w:tcW w:type="dxa" w:w="4320"/>
           </w:tcPr>
           <w:p>
-            <w:pPr>
-              <w:jc w:val="center"/>
-            </w:pPr>
             <w:r>
-              <w:rPr>
-                <w:rFonts w:ascii="Microsoft YaHei" w:hAnsi="Microsoft YaHei" w:eastAsia="Microsoft YaHei"/>
-                <w:sz w:val="18"/>
-              </w:rPr>
               <w:t>ECMS</w:t>
             </w:r>
           </w:p>
@@ -3620,14 +2612,7 @@
             <w:tcW w:type="dxa" w:w="4320"/>
           </w:tcPr>
           <w:p>
-            <w:pPr>
-              <w:jc w:val="center"/>
-            </w:pPr>
             <w:r>
-              <w:rPr>
-                <w:rFonts w:ascii="Microsoft YaHei" w:hAnsi="Microsoft YaHei" w:eastAsia="Microsoft YaHei"/>
-                <w:sz w:val="18"/>
-              </w:rPr>
               <w:t>最佳方案：MPC 提供参考等效因子 → A-ECMS 跟踪</w:t>
             </w:r>
           </w:p>
@@ -3637,14 +2622,7 @@
             <w:tcW w:type="dxa" w:w="4320"/>
           </w:tcPr>
           <w:p>
-            <w:pPr>
-              <w:jc w:val="center"/>
-            </w:pPr>
             <w:r>
-              <w:rPr>
-                <w:rFonts w:ascii="Microsoft YaHei" w:hAnsi="Microsoft YaHei" w:eastAsia="Microsoft YaHei"/>
-                <w:sz w:val="18"/>
-              </w:rPr>
               <w:t>MPC+A-ECMS 融合</w:t>
             </w:r>
           </w:p>
@@ -3680,15 +2658,7 @@
             <w:tcW w:type="dxa" w:w="2880"/>
           </w:tcPr>
           <w:p>
-            <w:pPr>
-              <w:jc w:val="center"/>
-            </w:pPr>
             <w:r>
-              <w:rPr>
-                <w:rFonts w:ascii="Microsoft YaHei" w:hAnsi="Microsoft YaHei" w:eastAsia="Microsoft YaHei"/>
-                <w:b/>
-                <w:sz w:val="19"/>
-              </w:rPr>
               <w:t>文件</w:t>
             </w:r>
           </w:p>
@@ -3698,15 +2668,7 @@
             <w:tcW w:type="dxa" w:w="2880"/>
           </w:tcPr>
           <w:p>
-            <w:pPr>
-              <w:jc w:val="center"/>
-            </w:pPr>
             <w:r>
-              <w:rPr>
-                <w:rFonts w:ascii="Microsoft YaHei" w:hAnsi="Microsoft YaHei" w:eastAsia="Microsoft YaHei"/>
-                <w:b/>
-                <w:sz w:val="19"/>
-              </w:rPr>
               <w:t>类型</w:t>
             </w:r>
           </w:p>
@@ -3716,15 +2678,7 @@
             <w:tcW w:type="dxa" w:w="2880"/>
           </w:tcPr>
           <w:p>
-            <w:pPr>
-              <w:jc w:val="center"/>
-            </w:pPr>
             <w:r>
-              <w:rPr>
-                <w:rFonts w:ascii="Microsoft YaHei" w:hAnsi="Microsoft YaHei" w:eastAsia="Microsoft YaHei"/>
-                <w:b/>
-                <w:sz w:val="19"/>
-              </w:rPr>
               <w:t>说明</w:t>
             </w:r>
           </w:p>
@@ -3736,14 +2690,7 @@
             <w:tcW w:type="dxa" w:w="2880"/>
           </w:tcPr>
           <w:p>
-            <w:pPr>
-              <w:jc w:val="center"/>
-            </w:pPr>
             <w:r>
-              <w:rPr>
-                <w:rFonts w:ascii="Microsoft YaHei" w:hAnsi="Microsoft YaHei" w:eastAsia="Microsoft YaHei"/>
-                <w:sz w:val="18"/>
-              </w:rPr>
               <w:t>docs/MPC_原理与实现_第7周学习笔记.md</w:t>
             </w:r>
           </w:p>
@@ -3753,14 +2700,7 @@
             <w:tcW w:type="dxa" w:w="2880"/>
           </w:tcPr>
           <w:p>
-            <w:pPr>
-              <w:jc w:val="center"/>
-            </w:pPr>
             <w:r>
-              <w:rPr>
-                <w:rFonts w:ascii="Microsoft YaHei" w:hAnsi="Microsoft YaHei" w:eastAsia="Microsoft YaHei"/>
-                <w:sz w:val="18"/>
-              </w:rPr>
               <w:t>文档</w:t>
             </w:r>
           </w:p>
@@ -3770,14 +2710,7 @@
             <w:tcW w:type="dxa" w:w="2880"/>
           </w:tcPr>
           <w:p>
-            <w:pPr>
-              <w:jc w:val="center"/>
-            </w:pPr>
             <w:r>
-              <w:rPr>
-                <w:rFonts w:ascii="Microsoft YaHei" w:hAnsi="Microsoft YaHei" w:eastAsia="Microsoft YaHei"/>
-                <w:sz w:val="18"/>
-              </w:rPr>
               <w:t>MPC 理论 + 数学框架 + 与 DP/ECMS 对比</w:t>
             </w:r>
           </w:p>
@@ -3789,14 +2722,7 @@
             <w:tcW w:type="dxa" w:w="2880"/>
           </w:tcPr>
           <w:p>
-            <w:pPr>
-              <w:jc w:val="center"/>
-            </w:pPr>
             <w:r>
-              <w:rPr>
-                <w:rFonts w:ascii="Microsoft YaHei" w:hAnsi="Microsoft YaHei" w:eastAsia="Microsoft YaHei"/>
-                <w:sz w:val="18"/>
-              </w:rPr>
               <w:t>scripts/mpc_ems.py</w:t>
             </w:r>
           </w:p>
@@ -3806,14 +2732,7 @@
             <w:tcW w:type="dxa" w:w="2880"/>
           </w:tcPr>
           <w:p>
-            <w:pPr>
-              <w:jc w:val="center"/>
-            </w:pPr>
             <w:r>
-              <w:rPr>
-                <w:rFonts w:ascii="Microsoft YaHei" w:hAnsi="Microsoft YaHei" w:eastAsia="Microsoft YaHei"/>
-                <w:sz w:val="18"/>
-              </w:rPr>
               <w:t>代码</w:t>
             </w:r>
           </w:p>
@@ -3823,14 +2742,7 @@
             <w:tcW w:type="dxa" w:w="2880"/>
           </w:tcPr>
           <w:p>
-            <w:pPr>
-              <w:jc w:val="center"/>
-            </w:pPr>
             <w:r>
-              <w:rPr>
-                <w:rFonts w:ascii="Microsoft YaHei" w:hAnsi="Microsoft YaHei" w:eastAsia="Microsoft YaHei"/>
-                <w:sz w:val="18"/>
-              </w:rPr>
               <w:t>MPC 实现（网格搜索 + N_p 扫描 + 四方法对比）</w:t>
             </w:r>
           </w:p>
@@ -3842,14 +2754,7 @@
             <w:tcW w:type="dxa" w:w="2880"/>
           </w:tcPr>
           <w:p>
-            <w:pPr>
-              <w:jc w:val="center"/>
-            </w:pPr>
             <w:r>
-              <w:rPr>
-                <w:rFonts w:ascii="Microsoft YaHei" w:hAnsi="Microsoft YaHei" w:eastAsia="Microsoft YaHei"/>
-                <w:sz w:val="18"/>
-              </w:rPr>
               <w:t>results/FourWay_compare_wltc.png</w:t>
             </w:r>
           </w:p>
@@ -3859,14 +2764,7 @@
             <w:tcW w:type="dxa" w:w="2880"/>
           </w:tcPr>
           <w:p>
-            <w:pPr>
-              <w:jc w:val="center"/>
-            </w:pPr>
             <w:r>
-              <w:rPr>
-                <w:rFonts w:ascii="Microsoft YaHei" w:hAnsi="Microsoft YaHei" w:eastAsia="Microsoft YaHei"/>
-                <w:sz w:val="18"/>
-              </w:rPr>
               <w:t>图表</w:t>
             </w:r>
           </w:p>
@@ -3876,14 +2774,7 @@
             <w:tcW w:type="dxa" w:w="2880"/>
           </w:tcPr>
           <w:p>
-            <w:pPr>
-              <w:jc w:val="center"/>
-            </w:pPr>
             <w:r>
-              <w:rPr>
-                <w:rFonts w:ascii="Microsoft YaHei" w:hAnsi="Microsoft YaHei" w:eastAsia="Microsoft YaHei"/>
-                <w:sz w:val="18"/>
-              </w:rPr>
               <w:t>WLTC 四方法对比图</w:t>
             </w:r>
           </w:p>
@@ -3895,14 +2786,7 @@
             <w:tcW w:type="dxa" w:w="2880"/>
           </w:tcPr>
           <w:p>
-            <w:pPr>
-              <w:jc w:val="center"/>
-            </w:pPr>
             <w:r>
-              <w:rPr>
-                <w:rFonts w:ascii="Microsoft YaHei" w:hAnsi="Microsoft YaHei" w:eastAsia="Microsoft YaHei"/>
-                <w:sz w:val="18"/>
-              </w:rPr>
               <w:t>results/MPC_np_sensitivity_wltc.png</w:t>
             </w:r>
           </w:p>
@@ -3912,14 +2796,7 @@
             <w:tcW w:type="dxa" w:w="2880"/>
           </w:tcPr>
           <w:p>
-            <w:pPr>
-              <w:jc w:val="center"/>
-            </w:pPr>
             <w:r>
-              <w:rPr>
-                <w:rFonts w:ascii="Microsoft YaHei" w:hAnsi="Microsoft YaHei" w:eastAsia="Microsoft YaHei"/>
-                <w:sz w:val="18"/>
-              </w:rPr>
               <w:t>图表</w:t>
             </w:r>
           </w:p>
@@ -3929,14 +2806,7 @@
             <w:tcW w:type="dxa" w:w="2880"/>
           </w:tcPr>
           <w:p>
-            <w:pPr>
-              <w:jc w:val="center"/>
-            </w:pPr>
             <w:r>
-              <w:rPr>
-                <w:rFonts w:ascii="Microsoft YaHei" w:hAnsi="Microsoft YaHei" w:eastAsia="Microsoft YaHei"/>
-                <w:sz w:val="18"/>
-              </w:rPr>
               <w:t>N_p 敏感性曲线</w:t>
             </w:r>
           </w:p>
@@ -3948,15 +2818,8 @@
             <w:tcW w:type="dxa" w:w="2880"/>
           </w:tcPr>
           <w:p>
-            <w:pPr>
-              <w:jc w:val="center"/>
-            </w:pPr>
             <w:r>
-              <w:rPr>
-                <w:rFonts w:ascii="Microsoft YaHei" w:hAnsi="Microsoft YaHei" w:eastAsia="Microsoft YaHei"/>
-                <w:sz w:val="18"/>
-              </w:rPr>
-              <w:t>results/mpc_ems_wltc_np50.csv</w:t>
+              <w:t>results/mpc_ems_optimized_wltc_np50.csv</w:t>
             </w:r>
           </w:p>
         </w:tc>
@@ -3965,14 +2828,7 @@
             <w:tcW w:type="dxa" w:w="2880"/>
           </w:tcPr>
           <w:p>
-            <w:pPr>
-              <w:jc w:val="center"/>
-            </w:pPr>
             <w:r>
-              <w:rPr>
-                <w:rFonts w:ascii="Microsoft YaHei" w:hAnsi="Microsoft YaHei" w:eastAsia="Microsoft YaHei"/>
-                <w:sz w:val="18"/>
-              </w:rPr>
               <w:t>数据</w:t>
             </w:r>
           </w:p>
@@ -3982,14 +2838,7 @@
             <w:tcW w:type="dxa" w:w="2880"/>
           </w:tcPr>
           <w:p>
-            <w:pPr>
-              <w:jc w:val="center"/>
-            </w:pPr>
             <w:r>
-              <w:rPr>
-                <w:rFonts w:ascii="Microsoft YaHei" w:hAnsi="Microsoft YaHei" w:eastAsia="Microsoft YaHei"/>
-                <w:sz w:val="18"/>
-              </w:rPr>
               <w:t>WLTC MPC 仿真结果</w:t>
             </w:r>
           </w:p>
@@ -4001,14 +2850,7 @@
             <w:tcW w:type="dxa" w:w="2880"/>
           </w:tcPr>
           <w:p>
-            <w:pPr>
-              <w:jc w:val="center"/>
-            </w:pPr>
             <w:r>
-              <w:rPr>
-                <w:rFonts w:ascii="Microsoft YaHei" w:hAnsi="Microsoft YaHei" w:eastAsia="Microsoft YaHei"/>
-                <w:sz w:val="18"/>
-              </w:rPr>
               <w:t>results/mpc_ems_nedc_np50.csv</w:t>
             </w:r>
           </w:p>
@@ -4018,14 +2860,7 @@
             <w:tcW w:type="dxa" w:w="2880"/>
           </w:tcPr>
           <w:p>
-            <w:pPr>
-              <w:jc w:val="center"/>
-            </w:pPr>
             <w:r>
-              <w:rPr>
-                <w:rFonts w:ascii="Microsoft YaHei" w:hAnsi="Microsoft YaHei" w:eastAsia="Microsoft YaHei"/>
-                <w:sz w:val="18"/>
-              </w:rPr>
               <w:t>数据</w:t>
             </w:r>
           </w:p>
@@ -4035,14 +2870,7 @@
             <w:tcW w:type="dxa" w:w="2880"/>
           </w:tcPr>
           <w:p>
-            <w:pPr>
-              <w:jc w:val="center"/>
-            </w:pPr>
             <w:r>
-              <w:rPr>
-                <w:rFonts w:ascii="Microsoft YaHei" w:hAnsi="Microsoft YaHei" w:eastAsia="Microsoft YaHei"/>
-                <w:sz w:val="18"/>
-              </w:rPr>
               <w:t>NEDC MPC 仿真结果</w:t>
             </w:r>
           </w:p>
@@ -4054,14 +2882,7 @@
             <w:tcW w:type="dxa" w:w="2880"/>
           </w:tcPr>
           <w:p>
-            <w:pPr>
-              <w:jc w:val="center"/>
-            </w:pPr>
             <w:r>
-              <w:rPr>
-                <w:rFonts w:ascii="Microsoft YaHei" w:hAnsi="Microsoft YaHei" w:eastAsia="Microsoft YaHei"/>
-                <w:sz w:val="18"/>
-              </w:rPr>
               <w:t>results/MPC_np_sensitivity_wltc.csv</w:t>
             </w:r>
           </w:p>
@@ -4071,14 +2892,7 @@
             <w:tcW w:type="dxa" w:w="2880"/>
           </w:tcPr>
           <w:p>
-            <w:pPr>
-              <w:jc w:val="center"/>
-            </w:pPr>
             <w:r>
-              <w:rPr>
-                <w:rFonts w:ascii="Microsoft YaHei" w:hAnsi="Microsoft YaHei" w:eastAsia="Microsoft YaHei"/>
-                <w:sz w:val="18"/>
-              </w:rPr>
               <w:t>数据</w:t>
             </w:r>
           </w:p>
@@ -4088,15 +2902,40 @@
             <w:tcW w:type="dxa" w:w="2880"/>
           </w:tcPr>
           <w:p>
-            <w:pPr>
-              <w:jc w:val="center"/>
-            </w:pPr>
             <w:r>
-              <w:rPr>
-                <w:rFonts w:ascii="Microsoft YaHei" w:hAnsi="Microsoft YaHei" w:eastAsia="Microsoft YaHei"/>
-                <w:sz w:val="18"/>
-              </w:rPr>
               <w:t>N_p 扫描原始数据</w:t>
+            </w:r>
+          </w:p>
+        </w:tc>
+      </w:tr>
+      <w:tr>
+        <w:tc>
+          <w:tcPr>
+            <w:tcW w:type="dxa" w:w="2880"/>
+          </w:tcPr>
+          <w:p>
+            <w:r>
+              <w:t>results/mpc_ems_optimized_wltc_np50_summary.csv</w:t>
+            </w:r>
+          </w:p>
+        </w:tc>
+        <w:tc>
+          <w:tcPr>
+            <w:tcW w:type="dxa" w:w="2880"/>
+          </w:tcPr>
+          <w:p>
+            <w:r>
+              <w:t>数据</w:t>
+            </w:r>
+          </w:p>
+        </w:tc>
+        <w:tc>
+          <w:tcPr>
+            <w:tcW w:type="dxa" w:w="2880"/>
+          </w:tcPr>
+          <w:p>
+            <w:r>
+              <w:t>优化版 MPC 公平比较摘要（H2_raw/SOC_end/H2_eq）</w:t>
             </w:r>
           </w:p>
         </w:tc>
@@ -4115,32 +2954,19 @@
     </w:p>
     <w:p>
       <w:r>
-        <w:rPr>
-          <w:rFonts w:ascii="Microsoft YaHei" w:hAnsi="Microsoft YaHei" w:eastAsia="Microsoft YaHei"/>
-          <w:b w:val="0"/>
-          <w:sz w:val="21"/>
-        </w:rPr>
-        <w:t>① 补全 NEDC/CLTC 四方法对比（统一框架）</w:t>
+        <w:t>① 先用优化版 MPC 重跑 WLTC/NEDC：输出 H2_raw、SOC_end、ΔSOC、SOC修正氢耗 H2_eq</w:t>
       </w:r>
     </w:p>
     <w:p>
       <w:r>
-        <w:rPr>
-          <w:rFonts w:ascii="Microsoft YaHei" w:hAnsi="Microsoft YaHei" w:eastAsia="Microsoft YaHei"/>
-          <w:b w:val="0"/>
-          <w:sz w:val="21"/>
-        </w:rPr>
-        <w:t>② 生成传统 EMS 策略对比报告（项目亮点1）</w:t>
+        <w:t>② 补全 NEDC/CLTC 四方法对比（统一框架），所有方法统一 charge-sustaining 口径</w:t>
       </w:r>
     </w:p>
     <w:p>
       <w:r>
-        <w:rPr>
-          <w:rFonts w:ascii="Microsoft YaHei" w:hAnsi="Microsoft YaHei" w:eastAsia="Microsoft YaHei"/>
-          <w:b w:val="0"/>
-          <w:sz w:val="21"/>
-        </w:rPr>
-        <w:t>③ 开始第3个月：PyTorch 入门</w:t>
+        <w:t>③ 生成传统 EMS 策略对比报告（项目亮点1），结论不再只按原始氢耗排序</w:t>
+        <w:br/>
+        <w:t>④ 开始第3个月：PyTorch 入门</w:t>
       </w:r>
     </w:p>
     <w:sectPr>

</xml_diff>